<commit_message>
Add artwork for enemy extension
</commit_message>
<xml_diff>
--- a/项目日志.docx
+++ b/项目日志.docx
@@ -21,35 +21,7 @@
         <w:rPr>
           <w:rFonts w:hint="eastAsia"/>
         </w:rPr>
-        <w:t>基本做完了战斗场景，</w:t>
-      </w:r>
-      <w:proofErr w:type="gramStart"/>
-      <w:r>
-        <w:rPr>
-          <w:rFonts w:hint="eastAsia"/>
-        </w:rPr>
-        <w:t>有一些图没扣</w:t>
-      </w:r>
-      <w:proofErr w:type="gramEnd"/>
-      <w:r>
-        <w:rPr>
-          <w:rFonts w:hint="eastAsia"/>
-        </w:rPr>
-        <w:t>白边，留了个小bug：卡</w:t>
-      </w:r>
-      <w:proofErr w:type="gramStart"/>
-      <w:r>
-        <w:rPr>
-          <w:rFonts w:hint="eastAsia"/>
-        </w:rPr>
-        <w:t>牌取消</w:t>
-      </w:r>
-      <w:proofErr w:type="gramEnd"/>
-      <w:r>
-        <w:rPr>
-          <w:rFonts w:hint="eastAsia"/>
-        </w:rPr>
-        <w:t>使用的时候悬停动画会消失，明天再修</w:t>
+        <w:t>基本做完了战斗场景，有一些图没扣白边，留了个小bug：卡牌取消使用的时候悬停动画会消失，明天再修</w:t>
       </w:r>
     </w:p>
     <w:p>
@@ -76,57 +48,15 @@
         <w:rPr>
           <w:rFonts w:hint="eastAsia"/>
         </w:rPr>
-        <w:t>急了，整</w:t>
-      </w:r>
-      <w:proofErr w:type="gramStart"/>
-      <w:r>
-        <w:rPr>
-          <w:rFonts w:hint="eastAsia"/>
-        </w:rPr>
-        <w:t>半天整不</w:t>
-      </w:r>
-      <w:proofErr w:type="gramEnd"/>
-      <w:r>
-        <w:rPr>
-          <w:rFonts w:hint="eastAsia"/>
-        </w:rPr>
-        <w:t>出来，看来对</w:t>
-      </w:r>
-      <w:proofErr w:type="spellStart"/>
-      <w:r>
-        <w:rPr>
-          <w:rFonts w:hint="eastAsia"/>
-        </w:rPr>
-        <w:t>godot</w:t>
-      </w:r>
-      <w:proofErr w:type="spellEnd"/>
-      <w:r>
-        <w:rPr>
-          <w:rFonts w:hint="eastAsia"/>
-        </w:rPr>
-        <w:t>确实是不太熟</w:t>
-      </w:r>
-    </w:p>
-    <w:p>
-      <w:r>
-        <w:rPr>
-          <w:rFonts w:hint="eastAsia"/>
-        </w:rPr>
-        <w:t>好的在经历千辛万苦之后终于改对了一个，大的还在后面呢。经验之谈：</w:t>
-      </w:r>
-      <w:proofErr w:type="gramStart"/>
-      <w:r>
-        <w:rPr>
-          <w:rFonts w:hint="eastAsia"/>
-        </w:rPr>
-        <w:t>提前跟</w:t>
-      </w:r>
-      <w:proofErr w:type="gramEnd"/>
-      <w:r>
-        <w:rPr>
-          <w:rFonts w:hint="eastAsia"/>
-        </w:rPr>
-        <w:t>他说好了一定要用节点啊啊啊啊啊</w:t>
+        <w:t>急了，整半天整不出来，看来对godot确实是不太熟</w:t>
+      </w:r>
+    </w:p>
+    <w:p>
+      <w:r>
+        <w:rPr>
+          <w:rFonts w:hint="eastAsia"/>
+        </w:rPr>
+        <w:t>好的在经历千辛万苦之后终于改对了一个，大的还在后面呢。经验之谈：提前跟他说好了一定要用节点啊啊啊啊啊</w:t>
       </w:r>
     </w:p>
     <w:p>
@@ -151,71 +81,15 @@
         <w:rPr>
           <w:rFonts w:hint="eastAsia"/>
         </w:rPr>
-        <w:t>好的又改对了一些，接下来要开始啃</w:t>
-      </w:r>
-      <w:proofErr w:type="spellStart"/>
-      <w:r>
-        <w:rPr>
-          <w:rFonts w:hint="eastAsia"/>
-        </w:rPr>
-        <w:t>battleui</w:t>
-      </w:r>
-      <w:proofErr w:type="spellEnd"/>
-      <w:r>
-        <w:rPr>
-          <w:rFonts w:hint="eastAsia"/>
-        </w:rPr>
-        <w:t>这一坨了，我好后悔啊！！</w:t>
-      </w:r>
-    </w:p>
-    <w:p>
-      <w:r>
-        <w:rPr>
-          <w:rFonts w:hint="eastAsia"/>
-        </w:rPr>
-        <w:t>他改的时候我也在想我到底该给游戏投入多少时间好，因为下周需要忙</w:t>
-      </w:r>
-      <w:proofErr w:type="spellStart"/>
-      <w:r>
-        <w:rPr>
-          <w:rFonts w:hint="eastAsia"/>
-        </w:rPr>
-        <w:t>GenerationAI</w:t>
-      </w:r>
-      <w:proofErr w:type="spellEnd"/>
-      <w:r>
-        <w:rPr>
-          <w:rFonts w:hint="eastAsia"/>
-        </w:rPr>
-        <w:t>那个项目，我那个项目还没啥进展呢其实，</w:t>
-      </w:r>
-      <w:proofErr w:type="gramStart"/>
-      <w:r>
-        <w:rPr>
-          <w:rFonts w:hint="eastAsia"/>
-        </w:rPr>
-        <w:t>听网课</w:t>
-      </w:r>
-      <w:proofErr w:type="gramEnd"/>
-      <w:r>
-        <w:rPr>
-          <w:rFonts w:hint="eastAsia"/>
-        </w:rPr>
-        <w:t>也</w:t>
-      </w:r>
-      <w:proofErr w:type="gramStart"/>
-      <w:r>
-        <w:rPr>
-          <w:rFonts w:hint="eastAsia"/>
-        </w:rPr>
-        <w:t>不咋认真</w:t>
-      </w:r>
-      <w:proofErr w:type="gramEnd"/>
-      <w:r>
-        <w:rPr>
-          <w:rFonts w:hint="eastAsia"/>
-        </w:rPr>
-        <w:t>说实话，有的课可能需要重新再看，但是又很费时间，不过这次我得记笔记了。加油吧Avis</w:t>
+        <w:t>好的又改对了一些，接下来要开始啃battleui这一坨了，我好后悔啊！！</w:t>
+      </w:r>
+    </w:p>
+    <w:p>
+      <w:r>
+        <w:rPr>
+          <w:rFonts w:hint="eastAsia"/>
+        </w:rPr>
+        <w:t>他改的时候我也在想我到底该给游戏投入多少时间好，因为下周需要忙GenerationAI那个项目，我那个项目还没啥进展呢其实，听网课也不咋认真说实话，有的课可能需要重新再看，但是又很费时间，不过这次我得记笔记了。加油吧Avis</w:t>
       </w:r>
     </w:p>
     <w:p>
@@ -229,21 +103,7 @@
         <w:rPr>
           <w:rFonts w:hint="eastAsia"/>
         </w:rPr>
-        <w:t>和左下角</w:t>
-      </w:r>
-      <w:proofErr w:type="gramStart"/>
-      <w:r>
-        <w:rPr>
-          <w:rFonts w:hint="eastAsia"/>
-        </w:rPr>
-        <w:t>信息框拆出来</w:t>
-      </w:r>
-      <w:proofErr w:type="gramEnd"/>
-      <w:r>
-        <w:rPr>
-          <w:rFonts w:hint="eastAsia"/>
-        </w:rPr>
-        <w:t>了，但是最恶心的还在后面，现在好像已经开始出问题了，我有一种不祥的预感。而且额度快爆了啊啊啊</w:t>
+        <w:t>和左下角信息框拆出来了，但是最恶心的还在后面，现在好像已经开始出问题了，我有一种不祥的预感。而且额度快爆了啊啊啊</w:t>
       </w:r>
     </w:p>
     <w:p>
@@ -355,28 +215,7 @@
         <w:rPr>
           <w:rFonts w:hint="eastAsia"/>
         </w:rPr>
-        <w:t>是用的</w:t>
-      </w:r>
-      <w:proofErr w:type="spellStart"/>
-      <w:r>
-        <w:rPr>
-          <w:rFonts w:hint="eastAsia"/>
-        </w:rPr>
-        <w:t>powershell</w:t>
-      </w:r>
-      <w:proofErr w:type="spellEnd"/>
-      <w:r>
-        <w:rPr>
-          <w:rFonts w:hint="eastAsia"/>
-        </w:rPr>
-        <w:t>.</w:t>
-      </w:r>
-      <w:proofErr w:type="gramStart"/>
-      <w:r>
-        <w:rPr>
-          <w:rFonts w:hint="eastAsia"/>
-        </w:rPr>
-        <w:t>.?然后</w:t>
+        <w:t>是用的powershell..?然后</w:t>
       </w:r>
       <w:r>
         <w:rPr>
@@ -394,14 +233,7 @@
         <w:rPr>
           <w:rFonts w:hint="eastAsia"/>
         </w:rPr>
-        <w:t>转成乱码</w:t>
-      </w:r>
-      <w:proofErr w:type="gramEnd"/>
-      <w:r>
-        <w:rPr>
-          <w:rFonts w:hint="eastAsia"/>
-        </w:rPr>
-        <w:t>，</w:t>
+        <w:t>转成乱码，</w:t>
       </w:r>
       <w:r>
         <w:rPr>
@@ -430,21 +262,7 @@
         <w:rPr>
           <w:rFonts w:hint="eastAsia"/>
         </w:rPr>
-        <w:t>问题不大还好我们在</w:t>
-      </w:r>
-      <w:proofErr w:type="spellStart"/>
-      <w:r>
-        <w:rPr>
-          <w:rFonts w:hint="eastAsia"/>
-        </w:rPr>
-        <w:t>github</w:t>
-      </w:r>
-      <w:proofErr w:type="spellEnd"/>
-      <w:r>
-        <w:rPr>
-          <w:rFonts w:hint="eastAsia"/>
-        </w:rPr>
-        <w:t>上保存了一次，我现在要开个分支然后去写作业了</w:t>
+        <w:t>问题不大还好我们在github上保存了一次，我现在要开个分支然后去写作业了</w:t>
       </w:r>
     </w:p>
     <w:p>
@@ -456,19 +274,11 @@
       </w:r>
     </w:p>
     <w:p>
-      <w:proofErr w:type="gramStart"/>
-      <w:r>
-        <w:rPr>
-          <w:rFonts w:hint="eastAsia"/>
-        </w:rPr>
-        <w:t>绷</w:t>
-      </w:r>
-      <w:proofErr w:type="gramEnd"/>
-      <w:r>
-        <w:rPr>
-          <w:rFonts w:hint="eastAsia"/>
-        </w:rPr>
-        <w:t>不住了word居然都能崩，我的项目日志还没保存呢</w:t>
+      <w:r>
+        <w:rPr>
+          <w:rFonts w:hint="eastAsia"/>
+        </w:rPr>
+        <w:t>绷不住了word居然都能崩，我的项目日志还没保存呢</w:t>
       </w:r>
     </w:p>
     <w:p>
@@ -480,16 +290,578 @@
       </w:r>
     </w:p>
     <w:p>
+      <w:r>
+        <w:rPr>
+          <w:rFonts w:hint="eastAsia"/>
+        </w:rPr>
+        <w:t>现在让它review一下顺便加个注释，我之前去看屎山的时候一点注释没有天塌了，还是得跟它说好了嗯，等它改完我就push然后歇菜了</w:t>
+      </w:r>
+    </w:p>
+    <w:p>
+      <w:r>
+        <w:rPr>
+          <w:rFonts w:hint="eastAsia"/>
+        </w:rPr>
+        <w:t>好的现在是晚上，刚才小调了一下项目文件结构，改了一张新的背景图，然后现在正在激情生成新怪物的图片</w:t>
+      </w:r>
+    </w:p>
+    <w:p>
       <w:pPr>
         <w:rPr>
-          <w:rFonts w:hint="eastAsia"/>
+          <w:strike/>
         </w:rPr>
       </w:pPr>
       <w:r>
         <w:rPr>
           <w:rFonts w:hint="eastAsia"/>
         </w:rPr>
-        <w:t>现在让它review一下顺便加个注释，我之前去看屎山的时候一点注释没有天塌了，还是得跟它说好了嗯，等它改完我就push然后歇菜了</w:t>
+        <w:t>生成了两只，继续继续，然后codex这边让它调调怪的站位，生图在用gpt本体的额度。</w:t>
+      </w:r>
+      <w:r>
+        <w:rPr>
+          <w:rFonts w:hint="eastAsia"/>
+          <w:strike/>
+        </w:rPr>
+        <w:t>Divide et impera!</w:t>
+      </w:r>
+    </w:p>
+    <w:p>
+      <w:r>
+        <w:rPr>
+          <w:rFonts w:hint="eastAsia"/>
+        </w:rPr>
+        <w:t>感觉这个还是得搭视觉才行，但是多模态太烧token，还是手来吧</w:t>
+      </w:r>
+    </w:p>
+    <w:p>
+      <w:r>
+        <w:rPr>
+          <w:rFonts w:hint="eastAsia"/>
+        </w:rPr>
+        <w:t>好的今天晚上主要的工作还是生成怪物了，展示一下！（文化/拼音/词汇）</w:t>
+      </w:r>
+    </w:p>
+    <w:p>
+      <w:r>
+        <w:rPr>
+          <w:rFonts w:hint="eastAsia"/>
+        </w:rPr>
+        <w:t>史莱姆：</w:t>
+      </w:r>
+      <w:r>
+        <w:rPr>
+          <w:rFonts w:hint="eastAsia"/>
+          <w:noProof/>
+        </w:rPr>
+        <w:drawing>
+          <wp:inline distT="0" distB="0" distL="0" distR="0" wp14:anchorId="26927BA0" wp14:editId="6680E7ED">
+            <wp:extent cx="765847" cy="765847"/>
+            <wp:effectExtent l="0" t="0" r="0" b="0"/>
+            <wp:docPr id="976253222" name="图片 3"/>
+            <wp:cNvGraphicFramePr>
+              <a:graphicFrameLocks xmlns:a="http://schemas.openxmlformats.org/drawingml/2006/main" noChangeAspect="1"/>
+            </wp:cNvGraphicFramePr>
+            <a:graphic xmlns:a="http://schemas.openxmlformats.org/drawingml/2006/main">
+              <a:graphicData uri="http://schemas.openxmlformats.org/drawingml/2006/picture">
+                <pic:pic xmlns:pic="http://schemas.openxmlformats.org/drawingml/2006/picture">
+                  <pic:nvPicPr>
+                    <pic:cNvPr id="0" name="Picture 3"/>
+                    <pic:cNvPicPr>
+                      <a:picLocks noChangeAspect="1" noChangeArrowheads="1"/>
+                    </pic:cNvPicPr>
+                  </pic:nvPicPr>
+                  <pic:blipFill>
+                    <a:blip r:embed="rId8" cstate="print">
+                      <a:extLst>
+                        <a:ext uri="{28A0092B-C50C-407E-A947-70E740481C1C}">
+                          <a14:useLocalDpi xmlns:a14="http://schemas.microsoft.com/office/drawing/2010/main" val="0"/>
+                        </a:ext>
+                      </a:extLst>
+                    </a:blip>
+                    <a:srcRect/>
+                    <a:stretch>
+                      <a:fillRect/>
+                    </a:stretch>
+                  </pic:blipFill>
+                  <pic:spPr bwMode="auto">
+                    <a:xfrm>
+                      <a:off x="0" y="0"/>
+                      <a:ext cx="774547" cy="774547"/>
+                    </a:xfrm>
+                    <a:prstGeom prst="rect">
+                      <a:avLst/>
+                    </a:prstGeom>
+                    <a:noFill/>
+                    <a:ln>
+                      <a:noFill/>
+                    </a:ln>
+                  </pic:spPr>
+                </pic:pic>
+              </a:graphicData>
+            </a:graphic>
+          </wp:inline>
+        </w:drawing>
+      </w:r>
+      <w:r>
+        <w:rPr>
+          <w:noProof/>
+        </w:rPr>
+        <w:drawing>
+          <wp:inline distT="0" distB="0" distL="0" distR="0" wp14:anchorId="67D8609A" wp14:editId="2F86EEB8">
+            <wp:extent cx="733773" cy="733773"/>
+            <wp:effectExtent l="0" t="0" r="9525" b="0"/>
+            <wp:docPr id="1594244930" name="图片 1"/>
+            <wp:cNvGraphicFramePr>
+              <a:graphicFrameLocks xmlns:a="http://schemas.openxmlformats.org/drawingml/2006/main" noChangeAspect="1"/>
+            </wp:cNvGraphicFramePr>
+            <a:graphic xmlns:a="http://schemas.openxmlformats.org/drawingml/2006/main">
+              <a:graphicData uri="http://schemas.openxmlformats.org/drawingml/2006/picture">
+                <pic:pic xmlns:pic="http://schemas.openxmlformats.org/drawingml/2006/picture">
+                  <pic:nvPicPr>
+                    <pic:cNvPr id="0" name="Picture 1"/>
+                    <pic:cNvPicPr>
+                      <a:picLocks noChangeAspect="1" noChangeArrowheads="1"/>
+                    </pic:cNvPicPr>
+                  </pic:nvPicPr>
+                  <pic:blipFill>
+                    <a:blip r:embed="rId9" cstate="print">
+                      <a:extLst>
+                        <a:ext uri="{28A0092B-C50C-407E-A947-70E740481C1C}">
+                          <a14:useLocalDpi xmlns:a14="http://schemas.microsoft.com/office/drawing/2010/main" val="0"/>
+                        </a:ext>
+                      </a:extLst>
+                    </a:blip>
+                    <a:srcRect/>
+                    <a:stretch>
+                      <a:fillRect/>
+                    </a:stretch>
+                  </pic:blipFill>
+                  <pic:spPr bwMode="auto">
+                    <a:xfrm flipH="1">
+                      <a:off x="0" y="0"/>
+                      <a:ext cx="746100" cy="746100"/>
+                    </a:xfrm>
+                    <a:prstGeom prst="rect">
+                      <a:avLst/>
+                    </a:prstGeom>
+                    <a:noFill/>
+                    <a:ln>
+                      <a:noFill/>
+                    </a:ln>
+                  </pic:spPr>
+                </pic:pic>
+              </a:graphicData>
+            </a:graphic>
+          </wp:inline>
+        </w:drawing>
+      </w:r>
+      <w:r>
+        <w:rPr>
+          <w:rFonts w:hint="eastAsia"/>
+          <w:noProof/>
+        </w:rPr>
+        <w:drawing>
+          <wp:inline distT="0" distB="0" distL="0" distR="0" wp14:anchorId="7ACF1EA5" wp14:editId="5FF0AF6E">
+            <wp:extent cx="710332" cy="723057"/>
+            <wp:effectExtent l="0" t="0" r="0" b="0"/>
+            <wp:docPr id="1565633632" name="图片 4"/>
+            <wp:cNvGraphicFramePr>
+              <a:graphicFrameLocks xmlns:a="http://schemas.openxmlformats.org/drawingml/2006/main" noChangeAspect="1"/>
+            </wp:cNvGraphicFramePr>
+            <a:graphic xmlns:a="http://schemas.openxmlformats.org/drawingml/2006/main">
+              <a:graphicData uri="http://schemas.openxmlformats.org/drawingml/2006/picture">
+                <pic:pic xmlns:pic="http://schemas.openxmlformats.org/drawingml/2006/picture">
+                  <pic:nvPicPr>
+                    <pic:cNvPr id="0" name="Picture 4"/>
+                    <pic:cNvPicPr>
+                      <a:picLocks noChangeAspect="1" noChangeArrowheads="1"/>
+                    </pic:cNvPicPr>
+                  </pic:nvPicPr>
+                  <pic:blipFill>
+                    <a:blip r:embed="rId10" cstate="print">
+                      <a:extLst>
+                        <a:ext uri="{28A0092B-C50C-407E-A947-70E740481C1C}">
+                          <a14:useLocalDpi xmlns:a14="http://schemas.microsoft.com/office/drawing/2010/main" val="0"/>
+                        </a:ext>
+                      </a:extLst>
+                    </a:blip>
+                    <a:srcRect/>
+                    <a:stretch>
+                      <a:fillRect/>
+                    </a:stretch>
+                  </pic:blipFill>
+                  <pic:spPr bwMode="auto">
+                    <a:xfrm>
+                      <a:off x="0" y="0"/>
+                      <a:ext cx="737675" cy="750889"/>
+                    </a:xfrm>
+                    <a:prstGeom prst="rect">
+                      <a:avLst/>
+                    </a:prstGeom>
+                    <a:noFill/>
+                    <a:ln>
+                      <a:noFill/>
+                    </a:ln>
+                  </pic:spPr>
+                </pic:pic>
+              </a:graphicData>
+            </a:graphic>
+          </wp:inline>
+        </w:drawing>
+      </w:r>
+    </w:p>
+    <w:p>
+      <w:r>
+        <w:rPr>
+          <w:rFonts w:hint="eastAsia"/>
+        </w:rPr>
+        <w:t>包子：</w:t>
+      </w:r>
+      <w:r>
+        <w:rPr>
+          <w:rFonts w:hint="eastAsia"/>
+          <w:noProof/>
+        </w:rPr>
+        <w:drawing>
+          <wp:inline distT="0" distB="0" distL="0" distR="0" wp14:anchorId="0F1ADB2E" wp14:editId="1EF2B404">
+            <wp:extent cx="704670" cy="681315"/>
+            <wp:effectExtent l="0" t="0" r="635" b="0"/>
+            <wp:docPr id="1415483168" name="图片 2"/>
+            <wp:cNvGraphicFramePr>
+              <a:graphicFrameLocks xmlns:a="http://schemas.openxmlformats.org/drawingml/2006/main" noChangeAspect="1"/>
+            </wp:cNvGraphicFramePr>
+            <a:graphic xmlns:a="http://schemas.openxmlformats.org/drawingml/2006/main">
+              <a:graphicData uri="http://schemas.openxmlformats.org/drawingml/2006/picture">
+                <pic:pic xmlns:pic="http://schemas.openxmlformats.org/drawingml/2006/picture">
+                  <pic:nvPicPr>
+                    <pic:cNvPr id="0" name="Picture 2"/>
+                    <pic:cNvPicPr>
+                      <a:picLocks noChangeAspect="1" noChangeArrowheads="1"/>
+                    </pic:cNvPicPr>
+                  </pic:nvPicPr>
+                  <pic:blipFill rotWithShape="1">
+                    <a:blip r:embed="rId11" cstate="print">
+                      <a:extLst>
+                        <a:ext uri="{28A0092B-C50C-407E-A947-70E740481C1C}">
+                          <a14:useLocalDpi xmlns:a14="http://schemas.microsoft.com/office/drawing/2010/main" val="0"/>
+                        </a:ext>
+                      </a:extLst>
+                    </a:blip>
+                    <a:srcRect t="12711" b="22878"/>
+                    <a:stretch>
+                      <a:fillRect/>
+                    </a:stretch>
+                  </pic:blipFill>
+                  <pic:spPr bwMode="auto">
+                    <a:xfrm>
+                      <a:off x="0" y="0"/>
+                      <a:ext cx="714897" cy="691203"/>
+                    </a:xfrm>
+                    <a:prstGeom prst="rect">
+                      <a:avLst/>
+                    </a:prstGeom>
+                    <a:noFill/>
+                    <a:ln>
+                      <a:noFill/>
+                    </a:ln>
+                    <a:extLst>
+                      <a:ext uri="{53640926-AAD7-44D8-BBD7-CCE9431645EC}">
+                        <a14:shadowObscured xmlns:a14="http://schemas.microsoft.com/office/drawing/2010/main"/>
+                      </a:ext>
+                    </a:extLst>
+                  </pic:spPr>
+                </pic:pic>
+              </a:graphicData>
+            </a:graphic>
+          </wp:inline>
+        </w:drawing>
+      </w:r>
+      <w:r>
+        <w:rPr>
+          <w:rFonts w:hint="eastAsia"/>
+          <w:noProof/>
+        </w:rPr>
+        <w:drawing>
+          <wp:inline distT="0" distB="0" distL="0" distR="0" wp14:anchorId="356AA3E8" wp14:editId="66928B31">
+            <wp:extent cx="718383" cy="718383"/>
+            <wp:effectExtent l="0" t="0" r="5715" b="0"/>
+            <wp:docPr id="758157981" name="图片 5"/>
+            <wp:cNvGraphicFramePr>
+              <a:graphicFrameLocks xmlns:a="http://schemas.openxmlformats.org/drawingml/2006/main" noChangeAspect="1"/>
+            </wp:cNvGraphicFramePr>
+            <a:graphic xmlns:a="http://schemas.openxmlformats.org/drawingml/2006/main">
+              <a:graphicData uri="http://schemas.openxmlformats.org/drawingml/2006/picture">
+                <pic:pic xmlns:pic="http://schemas.openxmlformats.org/drawingml/2006/picture">
+                  <pic:nvPicPr>
+                    <pic:cNvPr id="0" name="Picture 5"/>
+                    <pic:cNvPicPr>
+                      <a:picLocks noChangeAspect="1" noChangeArrowheads="1"/>
+                    </pic:cNvPicPr>
+                  </pic:nvPicPr>
+                  <pic:blipFill>
+                    <a:blip r:embed="rId12" cstate="print">
+                      <a:extLst>
+                        <a:ext uri="{28A0092B-C50C-407E-A947-70E740481C1C}">
+                          <a14:useLocalDpi xmlns:a14="http://schemas.microsoft.com/office/drawing/2010/main" val="0"/>
+                        </a:ext>
+                      </a:extLst>
+                    </a:blip>
+                    <a:srcRect/>
+                    <a:stretch>
+                      <a:fillRect/>
+                    </a:stretch>
+                  </pic:blipFill>
+                  <pic:spPr bwMode="auto">
+                    <a:xfrm>
+                      <a:off x="0" y="0"/>
+                      <a:ext cx="725777" cy="725777"/>
+                    </a:xfrm>
+                    <a:prstGeom prst="rect">
+                      <a:avLst/>
+                    </a:prstGeom>
+                    <a:noFill/>
+                    <a:ln>
+                      <a:noFill/>
+                    </a:ln>
+                  </pic:spPr>
+                </pic:pic>
+              </a:graphicData>
+            </a:graphic>
+          </wp:inline>
+        </w:drawing>
+      </w:r>
+      <w:r>
+        <w:rPr>
+          <w:rFonts w:hint="eastAsia"/>
+          <w:noProof/>
+        </w:rPr>
+        <w:drawing>
+          <wp:inline distT="0" distB="0" distL="0" distR="0" wp14:anchorId="493DC1A1" wp14:editId="66625CE4">
+            <wp:extent cx="760407" cy="760407"/>
+            <wp:effectExtent l="0" t="0" r="0" b="0"/>
+            <wp:docPr id="153488177" name="图片 6"/>
+            <wp:cNvGraphicFramePr>
+              <a:graphicFrameLocks xmlns:a="http://schemas.openxmlformats.org/drawingml/2006/main" noChangeAspect="1"/>
+            </wp:cNvGraphicFramePr>
+            <a:graphic xmlns:a="http://schemas.openxmlformats.org/drawingml/2006/main">
+              <a:graphicData uri="http://schemas.openxmlformats.org/drawingml/2006/picture">
+                <pic:pic xmlns:pic="http://schemas.openxmlformats.org/drawingml/2006/picture">
+                  <pic:nvPicPr>
+                    <pic:cNvPr id="0" name="Picture 6"/>
+                    <pic:cNvPicPr>
+                      <a:picLocks noChangeAspect="1" noChangeArrowheads="1"/>
+                    </pic:cNvPicPr>
+                  </pic:nvPicPr>
+                  <pic:blipFill>
+                    <a:blip r:embed="rId13" cstate="print">
+                      <a:extLst>
+                        <a:ext uri="{28A0092B-C50C-407E-A947-70E740481C1C}">
+                          <a14:useLocalDpi xmlns:a14="http://schemas.microsoft.com/office/drawing/2010/main" val="0"/>
+                        </a:ext>
+                      </a:extLst>
+                    </a:blip>
+                    <a:srcRect/>
+                    <a:stretch>
+                      <a:fillRect/>
+                    </a:stretch>
+                  </pic:blipFill>
+                  <pic:spPr bwMode="auto">
+                    <a:xfrm>
+                      <a:off x="0" y="0"/>
+                      <a:ext cx="769323" cy="769323"/>
+                    </a:xfrm>
+                    <a:prstGeom prst="rect">
+                      <a:avLst/>
+                    </a:prstGeom>
+                    <a:noFill/>
+                    <a:ln>
+                      <a:noFill/>
+                    </a:ln>
+                  </pic:spPr>
+                </pic:pic>
+              </a:graphicData>
+            </a:graphic>
+          </wp:inline>
+        </w:drawing>
+      </w:r>
+    </w:p>
+    <w:p>
+      <w:pPr>
+        <w:rPr>
+          <w:rFonts w:hint="eastAsia"/>
+        </w:rPr>
+      </w:pPr>
+      <w:r>
+        <w:rPr>
+          <w:rFonts w:hint="eastAsia"/>
+        </w:rPr>
+        <w:t>面具：</w:t>
+      </w:r>
+      <w:r>
+        <w:rPr>
+          <w:noProof/>
+        </w:rPr>
+        <w:drawing>
+          <wp:inline distT="0" distB="0" distL="0" distR="0" wp14:anchorId="13ACF960" wp14:editId="694064A7">
+            <wp:extent cx="754640" cy="754640"/>
+            <wp:effectExtent l="0" t="0" r="7620" b="0"/>
+            <wp:docPr id="1221841135" name="图片 7"/>
+            <wp:cNvGraphicFramePr>
+              <a:graphicFrameLocks xmlns:a="http://schemas.openxmlformats.org/drawingml/2006/main" noChangeAspect="1"/>
+            </wp:cNvGraphicFramePr>
+            <a:graphic xmlns:a="http://schemas.openxmlformats.org/drawingml/2006/main">
+              <a:graphicData uri="http://schemas.openxmlformats.org/drawingml/2006/picture">
+                <pic:pic xmlns:pic="http://schemas.openxmlformats.org/drawingml/2006/picture">
+                  <pic:nvPicPr>
+                    <pic:cNvPr id="0" name="Picture 7"/>
+                    <pic:cNvPicPr>
+                      <a:picLocks noChangeAspect="1" noChangeArrowheads="1"/>
+                    </pic:cNvPicPr>
+                  </pic:nvPicPr>
+                  <pic:blipFill>
+                    <a:blip r:embed="rId14" cstate="print">
+                      <a:extLst>
+                        <a:ext uri="{28A0092B-C50C-407E-A947-70E740481C1C}">
+                          <a14:useLocalDpi xmlns:a14="http://schemas.microsoft.com/office/drawing/2010/main" val="0"/>
+                        </a:ext>
+                      </a:extLst>
+                    </a:blip>
+                    <a:srcRect/>
+                    <a:stretch>
+                      <a:fillRect/>
+                    </a:stretch>
+                  </pic:blipFill>
+                  <pic:spPr bwMode="auto">
+                    <a:xfrm>
+                      <a:off x="0" y="0"/>
+                      <a:ext cx="764729" cy="764729"/>
+                    </a:xfrm>
+                    <a:prstGeom prst="rect">
+                      <a:avLst/>
+                    </a:prstGeom>
+                    <a:noFill/>
+                    <a:ln>
+                      <a:noFill/>
+                    </a:ln>
+                  </pic:spPr>
+                </pic:pic>
+              </a:graphicData>
+            </a:graphic>
+          </wp:inline>
+        </w:drawing>
+      </w:r>
+      <w:r>
+        <w:rPr>
+          <w:rFonts w:hint="eastAsia"/>
+          <w:noProof/>
+        </w:rPr>
+        <w:drawing>
+          <wp:inline distT="0" distB="0" distL="0" distR="0" wp14:anchorId="7FEDCFAE" wp14:editId="492345FA">
+            <wp:extent cx="723148" cy="723148"/>
+            <wp:effectExtent l="0" t="0" r="0" b="0"/>
+            <wp:docPr id="1505279082" name="图片 8"/>
+            <wp:cNvGraphicFramePr>
+              <a:graphicFrameLocks xmlns:a="http://schemas.openxmlformats.org/drawingml/2006/main" noChangeAspect="1"/>
+            </wp:cNvGraphicFramePr>
+            <a:graphic xmlns:a="http://schemas.openxmlformats.org/drawingml/2006/main">
+              <a:graphicData uri="http://schemas.openxmlformats.org/drawingml/2006/picture">
+                <pic:pic xmlns:pic="http://schemas.openxmlformats.org/drawingml/2006/picture">
+                  <pic:nvPicPr>
+                    <pic:cNvPr id="0" name="Picture 8"/>
+                    <pic:cNvPicPr>
+                      <a:picLocks noChangeAspect="1" noChangeArrowheads="1"/>
+                    </pic:cNvPicPr>
+                  </pic:nvPicPr>
+                  <pic:blipFill>
+                    <a:blip r:embed="rId15" cstate="print">
+                      <a:extLst>
+                        <a:ext uri="{28A0092B-C50C-407E-A947-70E740481C1C}">
+                          <a14:useLocalDpi xmlns:a14="http://schemas.microsoft.com/office/drawing/2010/main" val="0"/>
+                        </a:ext>
+                      </a:extLst>
+                    </a:blip>
+                    <a:srcRect/>
+                    <a:stretch>
+                      <a:fillRect/>
+                    </a:stretch>
+                  </pic:blipFill>
+                  <pic:spPr bwMode="auto">
+                    <a:xfrm>
+                      <a:off x="0" y="0"/>
+                      <a:ext cx="735505" cy="735505"/>
+                    </a:xfrm>
+                    <a:prstGeom prst="rect">
+                      <a:avLst/>
+                    </a:prstGeom>
+                    <a:noFill/>
+                    <a:ln>
+                      <a:noFill/>
+                    </a:ln>
+                  </pic:spPr>
+                </pic:pic>
+              </a:graphicData>
+            </a:graphic>
+          </wp:inline>
+        </w:drawing>
+      </w:r>
+      <w:r>
+        <w:rPr>
+          <w:rFonts w:hint="eastAsia"/>
+          <w:noProof/>
+        </w:rPr>
+        <w:drawing>
+          <wp:inline distT="0" distB="0" distL="0" distR="0" wp14:anchorId="6FF563E3" wp14:editId="51FBEF97">
+            <wp:extent cx="729406" cy="794623"/>
+            <wp:effectExtent l="0" t="0" r="0" b="0"/>
+            <wp:docPr id="1996480793" name="图片 9"/>
+            <wp:cNvGraphicFramePr>
+              <a:graphicFrameLocks xmlns:a="http://schemas.openxmlformats.org/drawingml/2006/main" noChangeAspect="1"/>
+            </wp:cNvGraphicFramePr>
+            <a:graphic xmlns:a="http://schemas.openxmlformats.org/drawingml/2006/main">
+              <a:graphicData uri="http://schemas.openxmlformats.org/drawingml/2006/picture">
+                <pic:pic xmlns:pic="http://schemas.openxmlformats.org/drawingml/2006/picture">
+                  <pic:nvPicPr>
+                    <pic:cNvPr id="0" name="Picture 9"/>
+                    <pic:cNvPicPr>
+                      <a:picLocks noChangeAspect="1" noChangeArrowheads="1"/>
+                    </pic:cNvPicPr>
+                  </pic:nvPicPr>
+                  <pic:blipFill rotWithShape="1">
+                    <a:blip r:embed="rId16" cstate="print">
+                      <a:extLst>
+                        <a:ext uri="{28A0092B-C50C-407E-A947-70E740481C1C}">
+                          <a14:useLocalDpi xmlns:a14="http://schemas.microsoft.com/office/drawing/2010/main" val="0"/>
+                        </a:ext>
+                      </a:extLst>
+                    </a:blip>
+                    <a:srcRect t="11498" b="15927"/>
+                    <a:stretch>
+                      <a:fillRect/>
+                    </a:stretch>
+                  </pic:blipFill>
+                  <pic:spPr bwMode="auto">
+                    <a:xfrm>
+                      <a:off x="0" y="0"/>
+                      <a:ext cx="747524" cy="814360"/>
+                    </a:xfrm>
+                    <a:prstGeom prst="rect">
+                      <a:avLst/>
+                    </a:prstGeom>
+                    <a:noFill/>
+                    <a:ln>
+                      <a:noFill/>
+                    </a:ln>
+                    <a:extLst>
+                      <a:ext uri="{53640926-AAD7-44D8-BBD7-CCE9431645EC}">
+                        <a14:shadowObscured xmlns:a14="http://schemas.microsoft.com/office/drawing/2010/main"/>
+                      </a:ext>
+                    </a:extLst>
+                  </pic:spPr>
+                </pic:pic>
+              </a:graphicData>
+            </a:graphic>
+          </wp:inline>
+        </w:drawing>
       </w:r>
     </w:p>
     <w:sectPr>

</xml_diff>

<commit_message>
Add AI rules, architecture, project context, and shield visualization
</commit_message>
<xml_diff>
--- a/项目日志.docx
+++ b/项目日志.docx
@@ -21,7 +21,35 @@
         <w:rPr>
           <w:rFonts w:hint="eastAsia"/>
         </w:rPr>
-        <w:t>基本做完了战斗场景，有一些图没扣白边，留了个小bug：卡牌取消使用的时候悬停动画会消失，明天再修</w:t>
+        <w:t>基本做完了战斗场景，</w:t>
+      </w:r>
+      <w:proofErr w:type="gramStart"/>
+      <w:r>
+        <w:rPr>
+          <w:rFonts w:hint="eastAsia"/>
+        </w:rPr>
+        <w:t>有一些图没扣</w:t>
+      </w:r>
+      <w:proofErr w:type="gramEnd"/>
+      <w:r>
+        <w:rPr>
+          <w:rFonts w:hint="eastAsia"/>
+        </w:rPr>
+        <w:t>白边，留了个小bug：卡</w:t>
+      </w:r>
+      <w:proofErr w:type="gramStart"/>
+      <w:r>
+        <w:rPr>
+          <w:rFonts w:hint="eastAsia"/>
+        </w:rPr>
+        <w:t>牌取消</w:t>
+      </w:r>
+      <w:proofErr w:type="gramEnd"/>
+      <w:r>
+        <w:rPr>
+          <w:rFonts w:hint="eastAsia"/>
+        </w:rPr>
+        <w:t>使用的时候悬停动画会消失，明天再修</w:t>
       </w:r>
     </w:p>
     <w:p>
@@ -48,15 +76,57 @@
         <w:rPr>
           <w:rFonts w:hint="eastAsia"/>
         </w:rPr>
-        <w:t>急了，整半天整不出来，看来对godot确实是不太熟</w:t>
-      </w:r>
-    </w:p>
-    <w:p>
-      <w:r>
-        <w:rPr>
-          <w:rFonts w:hint="eastAsia"/>
-        </w:rPr>
-        <w:t>好的在经历千辛万苦之后终于改对了一个，大的还在后面呢。经验之谈：提前跟他说好了一定要用节点啊啊啊啊啊</w:t>
+        <w:t>急了，整</w:t>
+      </w:r>
+      <w:proofErr w:type="gramStart"/>
+      <w:r>
+        <w:rPr>
+          <w:rFonts w:hint="eastAsia"/>
+        </w:rPr>
+        <w:t>半天整不</w:t>
+      </w:r>
+      <w:proofErr w:type="gramEnd"/>
+      <w:r>
+        <w:rPr>
+          <w:rFonts w:hint="eastAsia"/>
+        </w:rPr>
+        <w:t>出来，看来对</w:t>
+      </w:r>
+      <w:proofErr w:type="spellStart"/>
+      <w:r>
+        <w:rPr>
+          <w:rFonts w:hint="eastAsia"/>
+        </w:rPr>
+        <w:t>godot</w:t>
+      </w:r>
+      <w:proofErr w:type="spellEnd"/>
+      <w:r>
+        <w:rPr>
+          <w:rFonts w:hint="eastAsia"/>
+        </w:rPr>
+        <w:t>确实是不太熟</w:t>
+      </w:r>
+    </w:p>
+    <w:p>
+      <w:r>
+        <w:rPr>
+          <w:rFonts w:hint="eastAsia"/>
+        </w:rPr>
+        <w:t>好的在经历千辛万苦之后终于改对了一个，大的还在后面呢。经验之谈：</w:t>
+      </w:r>
+      <w:proofErr w:type="gramStart"/>
+      <w:r>
+        <w:rPr>
+          <w:rFonts w:hint="eastAsia"/>
+        </w:rPr>
+        <w:t>提前跟</w:t>
+      </w:r>
+      <w:proofErr w:type="gramEnd"/>
+      <w:r>
+        <w:rPr>
+          <w:rFonts w:hint="eastAsia"/>
+        </w:rPr>
+        <w:t>他说好了一定要用节点啊啊啊啊啊</w:t>
       </w:r>
     </w:p>
     <w:p>
@@ -81,15 +151,71 @@
         <w:rPr>
           <w:rFonts w:hint="eastAsia"/>
         </w:rPr>
-        <w:t>好的又改对了一些，接下来要开始啃battleui这一坨了，我好后悔啊！！</w:t>
-      </w:r>
-    </w:p>
-    <w:p>
-      <w:r>
-        <w:rPr>
-          <w:rFonts w:hint="eastAsia"/>
-        </w:rPr>
-        <w:t>他改的时候我也在想我到底该给游戏投入多少时间好，因为下周需要忙GenerationAI那个项目，我那个项目还没啥进展呢其实，听网课也不咋认真说实话，有的课可能需要重新再看，但是又很费时间，不过这次我得记笔记了。加油吧Avis</w:t>
+        <w:t>好的又改对了一些，接下来要开始啃</w:t>
+      </w:r>
+      <w:proofErr w:type="spellStart"/>
+      <w:r>
+        <w:rPr>
+          <w:rFonts w:hint="eastAsia"/>
+        </w:rPr>
+        <w:t>battleui</w:t>
+      </w:r>
+      <w:proofErr w:type="spellEnd"/>
+      <w:r>
+        <w:rPr>
+          <w:rFonts w:hint="eastAsia"/>
+        </w:rPr>
+        <w:t>这一坨了，我好后悔啊！！</w:t>
+      </w:r>
+    </w:p>
+    <w:p>
+      <w:r>
+        <w:rPr>
+          <w:rFonts w:hint="eastAsia"/>
+        </w:rPr>
+        <w:t>他改的时候我也在想我到底该给游戏投入多少时间好，因为下周需要忙</w:t>
+      </w:r>
+      <w:proofErr w:type="spellStart"/>
+      <w:r>
+        <w:rPr>
+          <w:rFonts w:hint="eastAsia"/>
+        </w:rPr>
+        <w:t>GenerationAI</w:t>
+      </w:r>
+      <w:proofErr w:type="spellEnd"/>
+      <w:r>
+        <w:rPr>
+          <w:rFonts w:hint="eastAsia"/>
+        </w:rPr>
+        <w:t>那个项目，我那个项目还没啥进展呢其实，</w:t>
+      </w:r>
+      <w:proofErr w:type="gramStart"/>
+      <w:r>
+        <w:rPr>
+          <w:rFonts w:hint="eastAsia"/>
+        </w:rPr>
+        <w:t>听网课</w:t>
+      </w:r>
+      <w:proofErr w:type="gramEnd"/>
+      <w:r>
+        <w:rPr>
+          <w:rFonts w:hint="eastAsia"/>
+        </w:rPr>
+        <w:t>也</w:t>
+      </w:r>
+      <w:proofErr w:type="gramStart"/>
+      <w:r>
+        <w:rPr>
+          <w:rFonts w:hint="eastAsia"/>
+        </w:rPr>
+        <w:t>不咋认真</w:t>
+      </w:r>
+      <w:proofErr w:type="gramEnd"/>
+      <w:r>
+        <w:rPr>
+          <w:rFonts w:hint="eastAsia"/>
+        </w:rPr>
+        <w:t>说实话，有的课可能需要重新再看，但是又很费时间，不过这次我得记笔记了。加油吧Avis</w:t>
       </w:r>
     </w:p>
     <w:p>
@@ -103,7 +229,21 @@
         <w:rPr>
           <w:rFonts w:hint="eastAsia"/>
         </w:rPr>
-        <w:t>和左下角信息框拆出来了，但是最恶心的还在后面，现在好像已经开始出问题了，我有一种不祥的预感。而且额度快爆了啊啊啊</w:t>
+        <w:t>和左下角</w:t>
+      </w:r>
+      <w:proofErr w:type="gramStart"/>
+      <w:r>
+        <w:rPr>
+          <w:rFonts w:hint="eastAsia"/>
+        </w:rPr>
+        <w:t>信息框拆出来</w:t>
+      </w:r>
+      <w:proofErr w:type="gramEnd"/>
+      <w:r>
+        <w:rPr>
+          <w:rFonts w:hint="eastAsia"/>
+        </w:rPr>
+        <w:t>了，但是最恶心的还在后面，现在好像已经开始出问题了，我有一种不祥的预感。而且额度快爆了啊啊啊</w:t>
       </w:r>
     </w:p>
     <w:p>
@@ -135,7 +275,7 @@
                     <pic:cNvPicPr/>
                   </pic:nvPicPr>
                   <pic:blipFill>
-                    <a:blip r:embed="rId6"/>
+                    <a:blip r:embed="rId7"/>
                     <a:stretch>
                       <a:fillRect/>
                     </a:stretch>
@@ -183,7 +323,7 @@
                     <pic:cNvPicPr/>
                   </pic:nvPicPr>
                   <pic:blipFill>
-                    <a:blip r:embed="rId7"/>
+                    <a:blip r:embed="rId8"/>
                     <a:stretch>
                       <a:fillRect/>
                     </a:stretch>
@@ -215,7 +355,28 @@
         <w:rPr>
           <w:rFonts w:hint="eastAsia"/>
         </w:rPr>
-        <w:t>是用的powershell..?然后</w:t>
+        <w:t>是用的</w:t>
+      </w:r>
+      <w:proofErr w:type="spellStart"/>
+      <w:r>
+        <w:rPr>
+          <w:rFonts w:hint="eastAsia"/>
+        </w:rPr>
+        <w:t>powershell</w:t>
+      </w:r>
+      <w:proofErr w:type="spellEnd"/>
+      <w:r>
+        <w:rPr>
+          <w:rFonts w:hint="eastAsia"/>
+        </w:rPr>
+        <w:t>.</w:t>
+      </w:r>
+      <w:proofErr w:type="gramStart"/>
+      <w:r>
+        <w:rPr>
+          <w:rFonts w:hint="eastAsia"/>
+        </w:rPr>
+        <w:t>.?然后</w:t>
       </w:r>
       <w:r>
         <w:rPr>
@@ -233,7 +394,14 @@
         <w:rPr>
           <w:rFonts w:hint="eastAsia"/>
         </w:rPr>
-        <w:t>转成乱码，</w:t>
+        <w:t>转成乱码</w:t>
+      </w:r>
+      <w:proofErr w:type="gramEnd"/>
+      <w:r>
+        <w:rPr>
+          <w:rFonts w:hint="eastAsia"/>
+        </w:rPr>
+        <w:t>，</w:t>
       </w:r>
       <w:r>
         <w:rPr>
@@ -262,7 +430,21 @@
         <w:rPr>
           <w:rFonts w:hint="eastAsia"/>
         </w:rPr>
-        <w:t>问题不大还好我们在github上保存了一次，我现在要开个分支然后去写作业了</w:t>
+        <w:t>问题不大还好我们在</w:t>
+      </w:r>
+      <w:proofErr w:type="spellStart"/>
+      <w:r>
+        <w:rPr>
+          <w:rFonts w:hint="eastAsia"/>
+        </w:rPr>
+        <w:t>github</w:t>
+      </w:r>
+      <w:proofErr w:type="spellEnd"/>
+      <w:r>
+        <w:rPr>
+          <w:rFonts w:hint="eastAsia"/>
+        </w:rPr>
+        <w:t>上保存了一次，我现在要开个分支然后去写作业了</w:t>
       </w:r>
     </w:p>
     <w:p>
@@ -274,11 +456,19 @@
       </w:r>
     </w:p>
     <w:p>
-      <w:r>
-        <w:rPr>
-          <w:rFonts w:hint="eastAsia"/>
-        </w:rPr>
-        <w:t>绷不住了word居然都能崩，我的项目日志还没保存呢</w:t>
+      <w:proofErr w:type="gramStart"/>
+      <w:r>
+        <w:rPr>
+          <w:rFonts w:hint="eastAsia"/>
+        </w:rPr>
+        <w:t>绷</w:t>
+      </w:r>
+      <w:proofErr w:type="gramEnd"/>
+      <w:r>
+        <w:rPr>
+          <w:rFonts w:hint="eastAsia"/>
+        </w:rPr>
+        <w:t>不住了word居然都能崩，我的项目日志还没保存呢</w:t>
       </w:r>
     </w:p>
     <w:p>
@@ -294,7 +484,35 @@
         <w:rPr>
           <w:rFonts w:hint="eastAsia"/>
         </w:rPr>
-        <w:t>现在让它review一下顺便加个注释，我之前去看屎山的时候一点注释没有天塌了，还是得跟它说好了嗯，等它改完我就push然后歇菜了</w:t>
+        <w:t>现在让它review一下顺便加个注释，我</w:t>
+      </w:r>
+      <w:proofErr w:type="gramStart"/>
+      <w:r>
+        <w:rPr>
+          <w:rFonts w:hint="eastAsia"/>
+        </w:rPr>
+        <w:t>之</w:t>
+      </w:r>
+      <w:proofErr w:type="gramEnd"/>
+      <w:r>
+        <w:rPr>
+          <w:rFonts w:hint="eastAsia"/>
+        </w:rPr>
+        <w:t>前去</w:t>
+      </w:r>
+      <w:proofErr w:type="gramStart"/>
+      <w:r>
+        <w:rPr>
+          <w:rFonts w:hint="eastAsia"/>
+        </w:rPr>
+        <w:t>看屎山</w:t>
+      </w:r>
+      <w:proofErr w:type="gramEnd"/>
+      <w:r>
+        <w:rPr>
+          <w:rFonts w:hint="eastAsia"/>
+        </w:rPr>
+        <w:t>的时候一点注释没有天塌了，还是得跟它说好了嗯，等它改完我就push然后歇菜了</w:t>
       </w:r>
     </w:p>
     <w:p>
@@ -315,22 +533,94 @@
         <w:rPr>
           <w:rFonts w:hint="eastAsia"/>
         </w:rPr>
-        <w:t>生成了两只，继续继续，然后codex这边让它调调怪的站位，生图在用gpt本体的额度。</w:t>
+        <w:t>生成了两只，继续</w:t>
+      </w:r>
+      <w:proofErr w:type="gramStart"/>
+      <w:r>
+        <w:rPr>
+          <w:rFonts w:hint="eastAsia"/>
+        </w:rPr>
+        <w:t>继续</w:t>
+      </w:r>
+      <w:proofErr w:type="gramEnd"/>
+      <w:r>
+        <w:rPr>
+          <w:rFonts w:hint="eastAsia"/>
+        </w:rPr>
+        <w:t>，然后codex</w:t>
+      </w:r>
+      <w:proofErr w:type="gramStart"/>
+      <w:r>
+        <w:rPr>
+          <w:rFonts w:hint="eastAsia"/>
+        </w:rPr>
+        <w:t>这边让</w:t>
+      </w:r>
+      <w:proofErr w:type="gramEnd"/>
+      <w:r>
+        <w:rPr>
+          <w:rFonts w:hint="eastAsia"/>
+        </w:rPr>
+        <w:t>它调调怪的站位，生图在用</w:t>
+      </w:r>
+      <w:proofErr w:type="spellStart"/>
+      <w:r>
+        <w:rPr>
+          <w:rFonts w:hint="eastAsia"/>
+        </w:rPr>
+        <w:t>gpt</w:t>
+      </w:r>
+      <w:proofErr w:type="spellEnd"/>
+      <w:r>
+        <w:rPr>
+          <w:rFonts w:hint="eastAsia"/>
+        </w:rPr>
+        <w:t>本体的额度。</w:t>
       </w:r>
       <w:r>
         <w:rPr>
           <w:rFonts w:hint="eastAsia"/>
           <w:strike/>
         </w:rPr>
-        <w:t>Divide et impera!</w:t>
-      </w:r>
-    </w:p>
-    <w:p>
-      <w:r>
-        <w:rPr>
-          <w:rFonts w:hint="eastAsia"/>
-        </w:rPr>
-        <w:t>感觉这个还是得搭视觉才行，但是多模态太烧token，还是手来吧</w:t>
+        <w:t xml:space="preserve">Divide et </w:t>
+      </w:r>
+      <w:proofErr w:type="spellStart"/>
+      <w:r>
+        <w:rPr>
+          <w:rFonts w:hint="eastAsia"/>
+          <w:strike/>
+        </w:rPr>
+        <w:t>impera</w:t>
+      </w:r>
+      <w:proofErr w:type="spellEnd"/>
+      <w:r>
+        <w:rPr>
+          <w:rFonts w:hint="eastAsia"/>
+          <w:strike/>
+        </w:rPr>
+        <w:t>!</w:t>
+      </w:r>
+    </w:p>
+    <w:p>
+      <w:r>
+        <w:rPr>
+          <w:rFonts w:hint="eastAsia"/>
+        </w:rPr>
+        <w:t>感觉这个还是得搭视觉才行，但是</w:t>
+      </w:r>
+      <w:proofErr w:type="gramStart"/>
+      <w:r>
+        <w:rPr>
+          <w:rFonts w:hint="eastAsia"/>
+        </w:rPr>
+        <w:t>多模态太烧</w:t>
+      </w:r>
+      <w:proofErr w:type="gramEnd"/>
+      <w:r>
+        <w:rPr>
+          <w:rFonts w:hint="eastAsia"/>
+        </w:rPr>
+        <w:t>token，还是手来吧</w:t>
       </w:r>
     </w:p>
     <w:p>
@@ -346,7 +636,21 @@
         <w:rPr>
           <w:rFonts w:hint="eastAsia"/>
         </w:rPr>
-        <w:t>史莱姆：</w:t>
+        <w:t>史莱</w:t>
+      </w:r>
+      <w:proofErr w:type="gramStart"/>
+      <w:r>
+        <w:rPr>
+          <w:rFonts w:hint="eastAsia"/>
+        </w:rPr>
+        <w:t>姆</w:t>
+      </w:r>
+      <w:proofErr w:type="gramEnd"/>
+      <w:r>
+        <w:rPr>
+          <w:rFonts w:hint="eastAsia"/>
+        </w:rPr>
+        <w:t>：</w:t>
       </w:r>
       <w:r>
         <w:rPr>
@@ -371,7 +675,7 @@
                     </pic:cNvPicPr>
                   </pic:nvPicPr>
                   <pic:blipFill>
-                    <a:blip r:embed="rId8" cstate="print">
+                    <a:blip r:embed="rId9" cstate="print">
                       <a:extLst>
                         <a:ext uri="{28A0092B-C50C-407E-A947-70E740481C1C}">
                           <a14:useLocalDpi xmlns:a14="http://schemas.microsoft.com/office/drawing/2010/main" val="0"/>
@@ -424,7 +728,7 @@
                     </pic:cNvPicPr>
                   </pic:nvPicPr>
                   <pic:blipFill>
-                    <a:blip r:embed="rId9" cstate="print">
+                    <a:blip r:embed="rId10" cstate="print">
                       <a:extLst>
                         <a:ext uri="{28A0092B-C50C-407E-A947-70E740481C1C}">
                           <a14:useLocalDpi xmlns:a14="http://schemas.microsoft.com/office/drawing/2010/main" val="0"/>
@@ -478,7 +782,7 @@
                     </pic:cNvPicPr>
                   </pic:nvPicPr>
                   <pic:blipFill>
-                    <a:blip r:embed="rId10" cstate="print">
+                    <a:blip r:embed="rId11" cstate="print">
                       <a:extLst>
                         <a:ext uri="{28A0092B-C50C-407E-A947-70E740481C1C}">
                           <a14:useLocalDpi xmlns:a14="http://schemas.microsoft.com/office/drawing/2010/main" val="0"/>
@@ -540,7 +844,7 @@
                     </pic:cNvPicPr>
                   </pic:nvPicPr>
                   <pic:blipFill rotWithShape="1">
-                    <a:blip r:embed="rId11" cstate="print">
+                    <a:blip r:embed="rId12" cstate="print">
                       <a:extLst>
                         <a:ext uri="{28A0092B-C50C-407E-A947-70E740481C1C}">
                           <a14:useLocalDpi xmlns:a14="http://schemas.microsoft.com/office/drawing/2010/main" val="0"/>
@@ -599,7 +903,7 @@
                     </pic:cNvPicPr>
                   </pic:nvPicPr>
                   <pic:blipFill>
-                    <a:blip r:embed="rId12" cstate="print">
+                    <a:blip r:embed="rId13" cstate="print">
                       <a:extLst>
                         <a:ext uri="{28A0092B-C50C-407E-A947-70E740481C1C}">
                           <a14:useLocalDpi xmlns:a14="http://schemas.microsoft.com/office/drawing/2010/main" val="0"/>
@@ -653,7 +957,7 @@
                     </pic:cNvPicPr>
                   </pic:nvPicPr>
                   <pic:blipFill>
-                    <a:blip r:embed="rId13" cstate="print">
+                    <a:blip r:embed="rId14" cstate="print">
                       <a:extLst>
                         <a:ext uri="{28A0092B-C50C-407E-A947-70E740481C1C}">
                           <a14:useLocalDpi xmlns:a14="http://schemas.microsoft.com/office/drawing/2010/main" val="0"/>
@@ -686,11 +990,6 @@
       </w:r>
     </w:p>
     <w:p>
-      <w:pPr>
-        <w:rPr>
-          <w:rFonts w:hint="eastAsia"/>
-        </w:rPr>
-      </w:pPr>
       <w:r>
         <w:rPr>
           <w:rFonts w:hint="eastAsia"/>
@@ -719,7 +1018,7 @@
                     </pic:cNvPicPr>
                   </pic:nvPicPr>
                   <pic:blipFill>
-                    <a:blip r:embed="rId14" cstate="print">
+                    <a:blip r:embed="rId15" cstate="print">
                       <a:extLst>
                         <a:ext uri="{28A0092B-C50C-407E-A947-70E740481C1C}">
                           <a14:useLocalDpi xmlns:a14="http://schemas.microsoft.com/office/drawing/2010/main" val="0"/>
@@ -773,7 +1072,7 @@
                     </pic:cNvPicPr>
                   </pic:nvPicPr>
                   <pic:blipFill>
-                    <a:blip r:embed="rId15" cstate="print">
+                    <a:blip r:embed="rId16" cstate="print">
                       <a:extLst>
                         <a:ext uri="{28A0092B-C50C-407E-A947-70E740481C1C}">
                           <a14:useLocalDpi xmlns:a14="http://schemas.microsoft.com/office/drawing/2010/main" val="0"/>
@@ -827,7 +1126,7 @@
                     </pic:cNvPicPr>
                   </pic:nvPicPr>
                   <pic:blipFill rotWithShape="1">
-                    <a:blip r:embed="rId16" cstate="print">
+                    <a:blip r:embed="rId17" cstate="print">
                       <a:extLst>
                         <a:ext uri="{28A0092B-C50C-407E-A947-70E740481C1C}">
                           <a14:useLocalDpi xmlns:a14="http://schemas.microsoft.com/office/drawing/2010/main" val="0"/>
@@ -864,6 +1163,842 @@
         </w:drawing>
       </w:r>
     </w:p>
+    <w:p>
+      <w:r>
+        <w:rPr>
+          <w:rFonts w:hint="eastAsia"/>
+        </w:rPr>
+        <w:t>2026.6.21</w:t>
+      </w:r>
+    </w:p>
+    <w:p>
+      <w:r>
+        <w:rPr>
+          <w:rFonts w:hint="eastAsia"/>
+        </w:rPr>
+        <w:t>首先先让ai把</w:t>
+      </w:r>
+      <w:proofErr w:type="gramStart"/>
+      <w:r>
+        <w:rPr>
+          <w:rFonts w:hint="eastAsia"/>
+        </w:rPr>
+        <w:t>这些怪都加到</w:t>
+      </w:r>
+      <w:proofErr w:type="gramEnd"/>
+      <w:r>
+        <w:rPr>
+          <w:rFonts w:hint="eastAsia"/>
+        </w:rPr>
+        <w:t>了游戏里，不过现在暂时还见不到</w:t>
+      </w:r>
+    </w:p>
+    <w:p>
+      <w:r>
+        <w:rPr>
+          <w:rFonts w:hint="eastAsia"/>
+        </w:rPr>
+        <w:lastRenderedPageBreak/>
+        <w:t>然后加了一个盾</w:t>
+      </w:r>
+      <w:r>
+        <w:rPr>
+          <w:noProof/>
+        </w:rPr>
+        <w:drawing>
+          <wp:inline distT="0" distB="0" distL="0" distR="0" wp14:anchorId="03614581" wp14:editId="121C24CE">
+            <wp:extent cx="781362" cy="781362"/>
+            <wp:effectExtent l="0" t="0" r="0" b="0"/>
+            <wp:docPr id="406733303" name="图片 1"/>
+            <wp:cNvGraphicFramePr>
+              <a:graphicFrameLocks xmlns:a="http://schemas.openxmlformats.org/drawingml/2006/main" noChangeAspect="1"/>
+            </wp:cNvGraphicFramePr>
+            <a:graphic xmlns:a="http://schemas.openxmlformats.org/drawingml/2006/main">
+              <a:graphicData uri="http://schemas.openxmlformats.org/drawingml/2006/picture">
+                <pic:pic xmlns:pic="http://schemas.openxmlformats.org/drawingml/2006/picture">
+                  <pic:nvPicPr>
+                    <pic:cNvPr id="0" name="Picture 1"/>
+                    <pic:cNvPicPr>
+                      <a:picLocks noChangeAspect="1" noChangeArrowheads="1"/>
+                    </pic:cNvPicPr>
+                  </pic:nvPicPr>
+                  <pic:blipFill>
+                    <a:blip r:embed="rId18" cstate="print">
+                      <a:extLst>
+                        <a:ext uri="{28A0092B-C50C-407E-A947-70E740481C1C}">
+                          <a14:useLocalDpi xmlns:a14="http://schemas.microsoft.com/office/drawing/2010/main" val="0"/>
+                        </a:ext>
+                      </a:extLst>
+                    </a:blip>
+                    <a:srcRect/>
+                    <a:stretch>
+                      <a:fillRect/>
+                    </a:stretch>
+                  </pic:blipFill>
+                  <pic:spPr bwMode="auto">
+                    <a:xfrm>
+                      <a:off x="0" y="0"/>
+                      <a:ext cx="785852" cy="785852"/>
+                    </a:xfrm>
+                    <a:prstGeom prst="rect">
+                      <a:avLst/>
+                    </a:prstGeom>
+                    <a:noFill/>
+                    <a:ln>
+                      <a:noFill/>
+                    </a:ln>
+                  </pic:spPr>
+                </pic:pic>
+              </a:graphicData>
+            </a:graphic>
+          </wp:inline>
+        </w:drawing>
+      </w:r>
+      <w:r>
+        <w:rPr>
+          <w:rFonts w:hint="eastAsia"/>
+        </w:rPr>
+        <w:t>个人</w:t>
+      </w:r>
+      <w:proofErr w:type="gramStart"/>
+      <w:r>
+        <w:rPr>
+          <w:rFonts w:hint="eastAsia"/>
+        </w:rPr>
+        <w:t>觉得抽卡结果</w:t>
+      </w:r>
+      <w:proofErr w:type="gramEnd"/>
+      <w:r>
+        <w:rPr>
+          <w:rFonts w:hint="eastAsia"/>
+        </w:rPr>
+        <w:t>还可以</w:t>
+      </w:r>
+    </w:p>
+    <w:p>
+      <w:r>
+        <w:rPr>
+          <w:rFonts w:hint="eastAsia"/>
+        </w:rPr>
+        <w:t>然后把左下角的信息改一下，写到了跟角色走的data里方便调整</w:t>
+      </w:r>
+    </w:p>
+    <w:p>
+      <w:r>
+        <w:rPr>
+          <w:rFonts w:hint="eastAsia"/>
+        </w:rPr>
+        <w:t>感觉还是可以加一个等级系统的，不过这个是长期的，我让codex整理了一下内容放在这里了：</w:t>
+      </w:r>
+    </w:p>
+    <w:p>
+      <w:pPr>
+        <w:rPr>
+          <w:b/>
+          <w:bCs/>
+        </w:rPr>
+      </w:pPr>
+      <w:r>
+        <w:rPr>
+          <w:b/>
+          <w:bCs/>
+        </w:rPr>
+        <w:t>等级与长期成长系统设计</w:t>
+      </w:r>
+    </w:p>
+    <w:p>
+      <w:pPr>
+        <w:rPr>
+          <w:b/>
+          <w:bCs/>
+        </w:rPr>
+      </w:pPr>
+      <w:r>
+        <w:rPr>
+          <w:b/>
+          <w:bCs/>
+        </w:rPr>
+        <w:t>等级</w:t>
+      </w:r>
+    </w:p>
+    <w:p>
+      <w:pPr>
+        <w:numPr>
+          <w:ilvl w:val="0"/>
+          <w:numId w:val="1"/>
+        </w:numPr>
+      </w:pPr>
+      <w:r>
+        <w:t>我方角色和敌人等级范围均为 1–10。</w:t>
+      </w:r>
+    </w:p>
+    <w:p>
+      <w:pPr>
+        <w:numPr>
+          <w:ilvl w:val="0"/>
+          <w:numId w:val="1"/>
+        </w:numPr>
+      </w:pPr>
+      <w:r>
+        <w:t>等级只提升数值，不改变技能规则和属性机制。</w:t>
+      </w:r>
+    </w:p>
+    <w:p>
+      <w:pPr>
+        <w:numPr>
+          <w:ilvl w:val="0"/>
+          <w:numId w:val="1"/>
+        </w:numPr>
+      </w:pPr>
+      <w:r>
+        <w:t>使用线性成长倍率，具体成长率以后确定。</w:t>
+      </w:r>
+    </w:p>
+    <w:p>
+      <w:pPr>
+        <w:rPr>
+          <w:b/>
+          <w:bCs/>
+        </w:rPr>
+      </w:pPr>
+      <w:r>
+        <w:rPr>
+          <w:b/>
+          <w:bCs/>
+        </w:rPr>
+        <w:t>我方成长</w:t>
+      </w:r>
+    </w:p>
+    <w:p>
+      <w:r>
+        <w:t>等级提升：</w:t>
+      </w:r>
+    </w:p>
+    <w:p>
+      <w:pPr>
+        <w:numPr>
+          <w:ilvl w:val="0"/>
+          <w:numId w:val="2"/>
+        </w:numPr>
+      </w:pPr>
+      <w:r>
+        <w:t>最大生命值</w:t>
+      </w:r>
+    </w:p>
+    <w:p>
+      <w:pPr>
+        <w:numPr>
+          <w:ilvl w:val="0"/>
+          <w:numId w:val="2"/>
+        </w:numPr>
+      </w:pPr>
+      <w:r>
+        <w:t>专属</w:t>
+      </w:r>
+      <w:proofErr w:type="gramStart"/>
+      <w:r>
+        <w:t>攻击卡</w:t>
+      </w:r>
+      <w:proofErr w:type="gramEnd"/>
+      <w:r>
+        <w:t>伤害</w:t>
+      </w:r>
+    </w:p>
+    <w:p>
+      <w:pPr>
+        <w:numPr>
+          <w:ilvl w:val="0"/>
+          <w:numId w:val="2"/>
+        </w:numPr>
+      </w:pPr>
+      <w:r>
+        <w:t>专属技能卡伤害</w:t>
+      </w:r>
+    </w:p>
+    <w:p>
+      <w:pPr>
+        <w:numPr>
+          <w:ilvl w:val="0"/>
+          <w:numId w:val="2"/>
+        </w:numPr>
+      </w:pPr>
+      <w:r>
+        <w:t>专属</w:t>
+      </w:r>
+      <w:proofErr w:type="gramStart"/>
+      <w:r>
+        <w:t>防御卡减伤</w:t>
+      </w:r>
+      <w:proofErr w:type="gramEnd"/>
+    </w:p>
+    <w:p>
+      <w:pPr>
+        <w:numPr>
+          <w:ilvl w:val="0"/>
+          <w:numId w:val="2"/>
+        </w:numPr>
+      </w:pPr>
+      <w:r>
+        <w:t>其他专属卡的治疗、固定护盾等效果数值</w:t>
+      </w:r>
+    </w:p>
+    <w:p>
+      <w:r>
+        <w:t>等级不影响：</w:t>
+      </w:r>
+    </w:p>
+    <w:p>
+      <w:pPr>
+        <w:numPr>
+          <w:ilvl w:val="0"/>
+          <w:numId w:val="3"/>
+        </w:numPr>
+      </w:pPr>
+      <w:r>
+        <w:t>通用卡</w:t>
+      </w:r>
+    </w:p>
+    <w:p>
+      <w:pPr>
+        <w:numPr>
+          <w:ilvl w:val="0"/>
+          <w:numId w:val="3"/>
+        </w:numPr>
+      </w:pPr>
+      <w:r>
+        <w:t>AP 获取、上限和技能消耗</w:t>
+      </w:r>
+    </w:p>
+    <w:p>
+      <w:pPr>
+        <w:numPr>
+          <w:ilvl w:val="0"/>
+          <w:numId w:val="3"/>
+        </w:numPr>
+      </w:pPr>
+      <w:r>
+        <w:t>答题 AP 奖励</w:t>
+      </w:r>
+    </w:p>
+    <w:p>
+      <w:pPr>
+        <w:numPr>
+          <w:ilvl w:val="0"/>
+          <w:numId w:val="3"/>
+        </w:numPr>
+      </w:pPr>
+      <w:r>
+        <w:t>属性被动</w:t>
+      </w:r>
+    </w:p>
+    <w:p>
+      <w:pPr>
+        <w:rPr>
+          <w:b/>
+          <w:bCs/>
+        </w:rPr>
+      </w:pPr>
+      <w:r>
+        <w:rPr>
+          <w:b/>
+          <w:bCs/>
+        </w:rPr>
+        <w:t>敌方成长</w:t>
+      </w:r>
+    </w:p>
+    <w:p>
+      <w:r>
+        <w:t>等级提升：</w:t>
+      </w:r>
+    </w:p>
+    <w:p>
+      <w:pPr>
+        <w:numPr>
+          <w:ilvl w:val="0"/>
+          <w:numId w:val="4"/>
+        </w:numPr>
+      </w:pPr>
+      <w:r>
+        <w:t>最大生命值</w:t>
+      </w:r>
+    </w:p>
+    <w:p>
+      <w:pPr>
+        <w:numPr>
+          <w:ilvl w:val="0"/>
+          <w:numId w:val="4"/>
+        </w:numPr>
+      </w:pPr>
+      <w:r>
+        <w:t>敌方技能的数值效果</w:t>
+      </w:r>
+    </w:p>
+    <w:p>
+      <w:r>
+        <w:lastRenderedPageBreak/>
+        <w:t>敌人不增加独立攻击力或防御力，等级直接影响技能基础数值。</w:t>
+      </w:r>
+    </w:p>
+    <w:p>
+      <w:pPr>
+        <w:rPr>
+          <w:b/>
+          <w:bCs/>
+        </w:rPr>
+      </w:pPr>
+      <w:r>
+        <w:rPr>
+          <w:b/>
+          <w:bCs/>
+        </w:rPr>
+        <w:t>货币</w:t>
+      </w:r>
+    </w:p>
+    <w:p>
+      <w:pPr>
+        <w:numPr>
+          <w:ilvl w:val="0"/>
+          <w:numId w:val="5"/>
+        </w:numPr>
+      </w:pPr>
+      <w:r>
+        <w:t>New TOEFL：单局货币，用于商店购买通用卡牌。</w:t>
+      </w:r>
+    </w:p>
+    <w:p>
+      <w:pPr>
+        <w:numPr>
+          <w:ilvl w:val="0"/>
+          <w:numId w:val="5"/>
+        </w:numPr>
+      </w:pPr>
+      <w:r>
+        <w:t>Old TOEFL：永久货币，用于升级我方角色。</w:t>
+      </w:r>
+    </w:p>
+    <w:p>
+      <w:pPr>
+        <w:numPr>
+          <w:ilvl w:val="0"/>
+          <w:numId w:val="5"/>
+        </w:numPr>
+      </w:pPr>
+      <w:r>
+        <w:t>通关后根据评分将可转换的 New TOEFL 转化为 Old TOEFL。</w:t>
+      </w:r>
+    </w:p>
+    <w:p>
+      <w:pPr>
+        <w:numPr>
+          <w:ilvl w:val="0"/>
+          <w:numId w:val="5"/>
+        </w:numPr>
+      </w:pPr>
+      <w:r>
+        <w:t>未通关不进行转换。</w:t>
+      </w:r>
+    </w:p>
+    <w:p>
+      <w:pPr>
+        <w:rPr>
+          <w:b/>
+          <w:bCs/>
+        </w:rPr>
+      </w:pPr>
+      <w:r>
+        <w:rPr>
+          <w:b/>
+          <w:bCs/>
+        </w:rPr>
+        <w:t>关卡评分</w:t>
+      </w:r>
+    </w:p>
+    <w:tbl>
+      <w:tblPr>
+        <w:tblW w:w="0" w:type="auto"/>
+        <w:tblCellSpacing w:w="15" w:type="dxa"/>
+        <w:tblCellMar>
+          <w:top w:w="15" w:type="dxa"/>
+          <w:left w:w="15" w:type="dxa"/>
+          <w:bottom w:w="15" w:type="dxa"/>
+          <w:right w:w="15" w:type="dxa"/>
+        </w:tblCellMar>
+        <w:tblLook w:val="04A0" w:firstRow="1" w:lastRow="0" w:firstColumn="1" w:lastColumn="0" w:noHBand="0" w:noVBand="1"/>
+      </w:tblPr>
+      <w:tblGrid>
+        <w:gridCol w:w="515"/>
+        <w:gridCol w:w="955"/>
+      </w:tblGrid>
+      <w:tr>
+        <w:trPr>
+          <w:tblHeader/>
+          <w:tblCellSpacing w:w="15" w:type="dxa"/>
+        </w:trPr>
+        <w:tc>
+          <w:tcPr>
+            <w:tcW w:w="0" w:type="auto"/>
+            <w:vAlign w:val="center"/>
+            <w:hideMark/>
+          </w:tcPr>
+          <w:p>
+            <w:pPr>
+              <w:rPr>
+                <w:b/>
+                <w:bCs/>
+              </w:rPr>
+            </w:pPr>
+            <w:r>
+              <w:rPr>
+                <w:b/>
+                <w:bCs/>
+              </w:rPr>
+              <w:t>评分</w:t>
+            </w:r>
+          </w:p>
+        </w:tc>
+        <w:tc>
+          <w:tcPr>
+            <w:tcW w:w="0" w:type="auto"/>
+            <w:vAlign w:val="center"/>
+            <w:hideMark/>
+          </w:tcPr>
+          <w:p>
+            <w:pPr>
+              <w:rPr>
+                <w:b/>
+                <w:bCs/>
+              </w:rPr>
+            </w:pPr>
+            <w:r>
+              <w:rPr>
+                <w:b/>
+                <w:bCs/>
+              </w:rPr>
+              <w:t>转换倍率</w:t>
+            </w:r>
+          </w:p>
+        </w:tc>
+      </w:tr>
+      <w:tr>
+        <w:trPr>
+          <w:tblCellSpacing w:w="15" w:type="dxa"/>
+        </w:trPr>
+        <w:tc>
+          <w:tcPr>
+            <w:tcW w:w="0" w:type="auto"/>
+            <w:vAlign w:val="center"/>
+            <w:hideMark/>
+          </w:tcPr>
+          <w:p>
+            <w:r>
+              <w:t>A</w:t>
+            </w:r>
+          </w:p>
+        </w:tc>
+        <w:tc>
+          <w:tcPr>
+            <w:tcW w:w="0" w:type="auto"/>
+            <w:vAlign w:val="center"/>
+            <w:hideMark/>
+          </w:tcPr>
+          <w:p>
+            <w:pPr>
+              <w:rPr>
+                <w:rFonts w:hint="eastAsia"/>
+              </w:rPr>
+            </w:pPr>
+            <w:r>
+              <w:t>×5</w:t>
+            </w:r>
+          </w:p>
+        </w:tc>
+      </w:tr>
+      <w:tr>
+        <w:trPr>
+          <w:tblCellSpacing w:w="15" w:type="dxa"/>
+        </w:trPr>
+        <w:tc>
+          <w:tcPr>
+            <w:tcW w:w="0" w:type="auto"/>
+            <w:vAlign w:val="center"/>
+            <w:hideMark/>
+          </w:tcPr>
+          <w:p>
+            <w:r>
+              <w:t>B</w:t>
+            </w:r>
+          </w:p>
+        </w:tc>
+        <w:tc>
+          <w:tcPr>
+            <w:tcW w:w="0" w:type="auto"/>
+            <w:vAlign w:val="center"/>
+            <w:hideMark/>
+          </w:tcPr>
+          <w:p>
+            <w:pPr>
+              <w:rPr>
+                <w:rFonts w:hint="eastAsia"/>
+              </w:rPr>
+            </w:pPr>
+            <w:r>
+              <w:t>×4</w:t>
+            </w:r>
+          </w:p>
+        </w:tc>
+      </w:tr>
+      <w:tr>
+        <w:trPr>
+          <w:tblCellSpacing w:w="15" w:type="dxa"/>
+        </w:trPr>
+        <w:tc>
+          <w:tcPr>
+            <w:tcW w:w="0" w:type="auto"/>
+            <w:vAlign w:val="center"/>
+            <w:hideMark/>
+          </w:tcPr>
+          <w:p>
+            <w:r>
+              <w:t>C</w:t>
+            </w:r>
+          </w:p>
+        </w:tc>
+        <w:tc>
+          <w:tcPr>
+            <w:tcW w:w="0" w:type="auto"/>
+            <w:vAlign w:val="center"/>
+            <w:hideMark/>
+          </w:tcPr>
+          <w:p>
+            <w:pPr>
+              <w:rPr>
+                <w:rFonts w:hint="eastAsia"/>
+              </w:rPr>
+            </w:pPr>
+            <w:r>
+              <w:t>×3</w:t>
+            </w:r>
+          </w:p>
+        </w:tc>
+      </w:tr>
+      <w:tr>
+        <w:trPr>
+          <w:tblCellSpacing w:w="15" w:type="dxa"/>
+        </w:trPr>
+        <w:tc>
+          <w:tcPr>
+            <w:tcW w:w="0" w:type="auto"/>
+            <w:vAlign w:val="center"/>
+            <w:hideMark/>
+          </w:tcPr>
+          <w:p>
+            <w:r>
+              <w:t>D</w:t>
+            </w:r>
+          </w:p>
+        </w:tc>
+        <w:tc>
+          <w:tcPr>
+            <w:tcW w:w="0" w:type="auto"/>
+            <w:vAlign w:val="center"/>
+            <w:hideMark/>
+          </w:tcPr>
+          <w:p>
+            <w:pPr>
+              <w:rPr>
+                <w:rFonts w:hint="eastAsia"/>
+              </w:rPr>
+            </w:pPr>
+            <w:r>
+              <w:t>×2</w:t>
+            </w:r>
+          </w:p>
+        </w:tc>
+      </w:tr>
+      <w:tr>
+        <w:trPr>
+          <w:tblCellSpacing w:w="15" w:type="dxa"/>
+        </w:trPr>
+        <w:tc>
+          <w:tcPr>
+            <w:tcW w:w="0" w:type="auto"/>
+            <w:vAlign w:val="center"/>
+            <w:hideMark/>
+          </w:tcPr>
+          <w:p>
+            <w:r>
+              <w:t>E</w:t>
+            </w:r>
+          </w:p>
+        </w:tc>
+        <w:tc>
+          <w:tcPr>
+            <w:tcW w:w="0" w:type="auto"/>
+            <w:vAlign w:val="center"/>
+            <w:hideMark/>
+          </w:tcPr>
+          <w:p>
+            <w:pPr>
+              <w:rPr>
+                <w:rFonts w:hint="eastAsia"/>
+              </w:rPr>
+            </w:pPr>
+            <w:r>
+              <w:t>×1</w:t>
+            </w:r>
+          </w:p>
+        </w:tc>
+      </w:tr>
+      <w:tr>
+        <w:trPr>
+          <w:tblCellSpacing w:w="15" w:type="dxa"/>
+        </w:trPr>
+        <w:tc>
+          <w:tcPr>
+            <w:tcW w:w="0" w:type="auto"/>
+            <w:vAlign w:val="center"/>
+            <w:hideMark/>
+          </w:tcPr>
+          <w:p>
+            <w:r>
+              <w:t>F</w:t>
+            </w:r>
+          </w:p>
+        </w:tc>
+        <w:tc>
+          <w:tcPr>
+            <w:tcW w:w="0" w:type="auto"/>
+            <w:vAlign w:val="center"/>
+            <w:hideMark/>
+          </w:tcPr>
+          <w:p>
+            <w:pPr>
+              <w:rPr>
+                <w:rFonts w:hint="eastAsia"/>
+              </w:rPr>
+            </w:pPr>
+            <w:r>
+              <w:t>×0</w:t>
+            </w:r>
+          </w:p>
+        </w:tc>
+      </w:tr>
+    </w:tbl>
+    <w:p>
+      <w:r>
+        <w:t>Old TOEFL = 可转换的 New TOEFL × 评分倍率</w:t>
+      </w:r>
+    </w:p>
+    <w:p>
+      <w:pPr>
+        <w:rPr>
+          <w:b/>
+          <w:bCs/>
+        </w:rPr>
+      </w:pPr>
+      <w:r>
+        <w:rPr>
+          <w:b/>
+          <w:bCs/>
+        </w:rPr>
+        <w:t>升级费用</w:t>
+      </w:r>
+    </w:p>
+    <w:p>
+      <w:r>
+        <w:t>升级费用 = 当前等级 × 2 Old TOEFL</w:t>
+      </w:r>
+    </w:p>
+    <w:p>
+      <w:r>
+        <w:t>从 1 级升到 10 级总计需要 90 Old TOEFL。</w:t>
+      </w:r>
+    </w:p>
+    <w:p>
+      <w:pPr>
+        <w:rPr>
+          <w:b/>
+          <w:bCs/>
+        </w:rPr>
+      </w:pPr>
+      <w:r>
+        <w:rPr>
+          <w:b/>
+          <w:bCs/>
+        </w:rPr>
+        <w:t>未来实现原则</w:t>
+      </w:r>
+    </w:p>
+    <w:p>
+      <w:pPr>
+        <w:numPr>
+          <w:ilvl w:val="0"/>
+          <w:numId w:val="6"/>
+        </w:numPr>
+      </w:pPr>
+      <w:r>
+        <w:t>JSON 保存基础数值和成长率。</w:t>
+      </w:r>
+    </w:p>
+    <w:p>
+      <w:pPr>
+        <w:numPr>
+          <w:ilvl w:val="0"/>
+          <w:numId w:val="6"/>
+        </w:numPr>
+      </w:pPr>
+      <w:r>
+        <w:t>存档保存角色等级、Old TOEFL 和关卡评分。</w:t>
+      </w:r>
+    </w:p>
+    <w:p>
+      <w:pPr>
+        <w:numPr>
+          <w:ilvl w:val="0"/>
+          <w:numId w:val="6"/>
+        </w:numPr>
+      </w:pPr>
+      <w:r>
+        <w:t>开战时根据等级计算本局数值。</w:t>
+      </w:r>
+    </w:p>
+    <w:p>
+      <w:pPr>
+        <w:numPr>
+          <w:ilvl w:val="0"/>
+          <w:numId w:val="6"/>
+        </w:numPr>
+      </w:pPr>
+      <w:r>
+        <w:t>不直接</w:t>
+      </w:r>
+      <w:proofErr w:type="gramStart"/>
+      <w:r>
+        <w:t>修改卡</w:t>
+      </w:r>
+      <w:proofErr w:type="gramEnd"/>
+      <w:r>
+        <w:t>牌和角色的原始基础值，避免重复应用倍率。</w:t>
+      </w:r>
+    </w:p>
+    <w:p>
+      <w:pPr>
+        <w:numPr>
+          <w:ilvl w:val="0"/>
+          <w:numId w:val="6"/>
+        </w:numPr>
+      </w:pPr>
+      <w:r>
+        <w:t>我方生命、我方专属卡、敌方生命和敌方技能可以采用不同成长率。</w:t>
+      </w:r>
+    </w:p>
+    <w:p>
+      <w:pPr>
+        <w:rPr>
+          <w:rFonts w:hint="eastAsia"/>
+        </w:rPr>
+      </w:pPr>
+    </w:p>
     <w:sectPr>
       <w:pgSz w:w="11906" w:h="16838"/>
       <w:pgMar w:top="1440" w:right="1800" w:bottom="1440" w:left="1800" w:header="851" w:footer="992" w:gutter="0"/>
@@ -922,6 +2057,923 @@
     </w:p>
   </w:footnote>
 </w:footnotes>
+</file>
+
+<file path=word/numbering.xml><?xml version="1.0" encoding="utf-8"?>
+<w:numbering xmlns:wpc="http://schemas.microsoft.com/office/word/2010/wordprocessingCanvas" xmlns:cx="http://schemas.microsoft.com/office/drawing/2014/chartex" xmlns:cx1="http://schemas.microsoft.com/office/drawing/2015/9/8/chartex" xmlns:cx2="http://schemas.microsoft.com/office/drawing/2015/10/21/chartex" xmlns:cx3="http://schemas.microsoft.com/office/drawing/2016/5/9/chartex" xmlns:cx4="http://schemas.microsoft.com/office/drawing/2016/5/10/chartex" xmlns:cx5="http://schemas.microsoft.com/office/drawing/2016/5/11/chartex" xmlns:cx6="http://schemas.microsoft.com/office/drawing/2016/5/12/chartex" xmlns:cx7="http://schemas.microsoft.com/office/drawing/2016/5/13/chartex" xmlns:cx8="http://schemas.microsoft.com/office/drawing/2016/5/14/chartex" xmlns:mc="http://schemas.openxmlformats.org/markup-compatibility/2006" xmlns:aink="http://schemas.microsoft.com/office/drawing/2016/ink" xmlns:am3d="http://schemas.microsoft.com/office/drawing/2017/model3d" xmlns:o="urn:schemas-microsoft-com:office:office" xmlns:oel="http://schemas.microsoft.com/office/2019/extlst" xmlns:r="http://schemas.openxmlformats.org/officeDocument/2006/relationships" xmlns:m="http://schemas.openxmlformats.org/officeDocument/2006/math" xmlns:v="urn:schemas-microsoft-com:vml" xmlns:wp14="http://schemas.microsoft.com/office/word/2010/wordprocessingDrawing" xmlns:wp="http://schemas.openxmlformats.org/drawingml/2006/wordprocessingDrawing" xmlns:w10="urn:schemas-microsoft-com:office:word" xmlns:w="http://schemas.openxmlformats.org/wordprocessingml/2006/main" xmlns:w14="http://schemas.microsoft.com/office/word/2010/wordml" xmlns:w15="http://schemas.microsoft.com/office/word/2012/wordml" xmlns:w16cex="http://schemas.microsoft.com/office/word/2018/wordml/cex" xmlns:w16cid="http://schemas.microsoft.com/office/word/2016/wordml/cid" xmlns:w16="http://schemas.microsoft.com/office/word/2018/wordml" xmlns:w16du="http://schemas.microsoft.com/office/word/2023/wordml/word16du" xmlns:w16sdtdh="http://schemas.microsoft.com/office/word/2020/wordml/sdtdatahash" xmlns:w16sdtfl="http://schemas.microsoft.com/office/word/2024/wordml/sdtformatlock" xmlns:w16se="http://schemas.microsoft.com/office/word/2015/wordml/symex" xmlns:wpg="http://schemas.microsoft.com/office/word/2010/wordprocessingGroup" xmlns:wpi="http://schemas.microsoft.com/office/word/2010/wordprocessingInk" xmlns:wne="http://schemas.microsoft.com/office/word/2006/wordml" xmlns:wps="http://schemas.microsoft.com/office/word/2010/wordprocessingShape" mc:Ignorable="w14 w15 w16se w16cid w16 w16cex w16sdtdh w16sdtfl w16du wp14">
+  <w:abstractNum w:abstractNumId="0" w15:restartNumberingAfterBreak="0">
+    <w:nsid w:val="09F64ADB"/>
+    <w:multiLevelType w:val="multilevel"/>
+    <w:tmpl w:val="E4E027A2"/>
+    <w:lvl w:ilvl="0">
+      <w:start w:val="1"/>
+      <w:numFmt w:val="bullet"/>
+      <w:lvlText w:val=""/>
+      <w:lvlJc w:val="left"/>
+      <w:pPr>
+        <w:tabs>
+          <w:tab w:val="num" w:pos="720"/>
+        </w:tabs>
+        <w:ind w:left="720" w:hanging="360"/>
+      </w:pPr>
+      <w:rPr>
+        <w:rFonts w:ascii="Symbol" w:hAnsi="Symbol" w:hint="default"/>
+        <w:sz w:val="20"/>
+      </w:rPr>
+    </w:lvl>
+    <w:lvl w:ilvl="1" w:tentative="1">
+      <w:start w:val="1"/>
+      <w:numFmt w:val="bullet"/>
+      <w:lvlText w:val="o"/>
+      <w:lvlJc w:val="left"/>
+      <w:pPr>
+        <w:tabs>
+          <w:tab w:val="num" w:pos="1440"/>
+        </w:tabs>
+        <w:ind w:left="1440" w:hanging="360"/>
+      </w:pPr>
+      <w:rPr>
+        <w:rFonts w:ascii="Courier New" w:hAnsi="Courier New" w:hint="default"/>
+        <w:sz w:val="20"/>
+      </w:rPr>
+    </w:lvl>
+    <w:lvl w:ilvl="2" w:tentative="1">
+      <w:start w:val="1"/>
+      <w:numFmt w:val="bullet"/>
+      <w:lvlText w:val=""/>
+      <w:lvlJc w:val="left"/>
+      <w:pPr>
+        <w:tabs>
+          <w:tab w:val="num" w:pos="2160"/>
+        </w:tabs>
+        <w:ind w:left="2160" w:hanging="360"/>
+      </w:pPr>
+      <w:rPr>
+        <w:rFonts w:ascii="Wingdings" w:hAnsi="Wingdings" w:hint="default"/>
+        <w:sz w:val="20"/>
+      </w:rPr>
+    </w:lvl>
+    <w:lvl w:ilvl="3" w:tentative="1">
+      <w:start w:val="1"/>
+      <w:numFmt w:val="bullet"/>
+      <w:lvlText w:val=""/>
+      <w:lvlJc w:val="left"/>
+      <w:pPr>
+        <w:tabs>
+          <w:tab w:val="num" w:pos="2880"/>
+        </w:tabs>
+        <w:ind w:left="2880" w:hanging="360"/>
+      </w:pPr>
+      <w:rPr>
+        <w:rFonts w:ascii="Wingdings" w:hAnsi="Wingdings" w:hint="default"/>
+        <w:sz w:val="20"/>
+      </w:rPr>
+    </w:lvl>
+    <w:lvl w:ilvl="4" w:tentative="1">
+      <w:start w:val="1"/>
+      <w:numFmt w:val="bullet"/>
+      <w:lvlText w:val=""/>
+      <w:lvlJc w:val="left"/>
+      <w:pPr>
+        <w:tabs>
+          <w:tab w:val="num" w:pos="3600"/>
+        </w:tabs>
+        <w:ind w:left="3600" w:hanging="360"/>
+      </w:pPr>
+      <w:rPr>
+        <w:rFonts w:ascii="Wingdings" w:hAnsi="Wingdings" w:hint="default"/>
+        <w:sz w:val="20"/>
+      </w:rPr>
+    </w:lvl>
+    <w:lvl w:ilvl="5" w:tentative="1">
+      <w:start w:val="1"/>
+      <w:numFmt w:val="bullet"/>
+      <w:lvlText w:val=""/>
+      <w:lvlJc w:val="left"/>
+      <w:pPr>
+        <w:tabs>
+          <w:tab w:val="num" w:pos="4320"/>
+        </w:tabs>
+        <w:ind w:left="4320" w:hanging="360"/>
+      </w:pPr>
+      <w:rPr>
+        <w:rFonts w:ascii="Wingdings" w:hAnsi="Wingdings" w:hint="default"/>
+        <w:sz w:val="20"/>
+      </w:rPr>
+    </w:lvl>
+    <w:lvl w:ilvl="6" w:tentative="1">
+      <w:start w:val="1"/>
+      <w:numFmt w:val="bullet"/>
+      <w:lvlText w:val=""/>
+      <w:lvlJc w:val="left"/>
+      <w:pPr>
+        <w:tabs>
+          <w:tab w:val="num" w:pos="5040"/>
+        </w:tabs>
+        <w:ind w:left="5040" w:hanging="360"/>
+      </w:pPr>
+      <w:rPr>
+        <w:rFonts w:ascii="Wingdings" w:hAnsi="Wingdings" w:hint="default"/>
+        <w:sz w:val="20"/>
+      </w:rPr>
+    </w:lvl>
+    <w:lvl w:ilvl="7" w:tentative="1">
+      <w:start w:val="1"/>
+      <w:numFmt w:val="bullet"/>
+      <w:lvlText w:val=""/>
+      <w:lvlJc w:val="left"/>
+      <w:pPr>
+        <w:tabs>
+          <w:tab w:val="num" w:pos="5760"/>
+        </w:tabs>
+        <w:ind w:left="5760" w:hanging="360"/>
+      </w:pPr>
+      <w:rPr>
+        <w:rFonts w:ascii="Wingdings" w:hAnsi="Wingdings" w:hint="default"/>
+        <w:sz w:val="20"/>
+      </w:rPr>
+    </w:lvl>
+    <w:lvl w:ilvl="8" w:tentative="1">
+      <w:start w:val="1"/>
+      <w:numFmt w:val="bullet"/>
+      <w:lvlText w:val=""/>
+      <w:lvlJc w:val="left"/>
+      <w:pPr>
+        <w:tabs>
+          <w:tab w:val="num" w:pos="6480"/>
+        </w:tabs>
+        <w:ind w:left="6480" w:hanging="360"/>
+      </w:pPr>
+      <w:rPr>
+        <w:rFonts w:ascii="Wingdings" w:hAnsi="Wingdings" w:hint="default"/>
+        <w:sz w:val="20"/>
+      </w:rPr>
+    </w:lvl>
+  </w:abstractNum>
+  <w:abstractNum w:abstractNumId="1" w15:restartNumberingAfterBreak="0">
+    <w:nsid w:val="2B727881"/>
+    <w:multiLevelType w:val="multilevel"/>
+    <w:tmpl w:val="940E6FBE"/>
+    <w:lvl w:ilvl="0">
+      <w:start w:val="1"/>
+      <w:numFmt w:val="bullet"/>
+      <w:lvlText w:val=""/>
+      <w:lvlJc w:val="left"/>
+      <w:pPr>
+        <w:tabs>
+          <w:tab w:val="num" w:pos="720"/>
+        </w:tabs>
+        <w:ind w:left="720" w:hanging="360"/>
+      </w:pPr>
+      <w:rPr>
+        <w:rFonts w:ascii="Symbol" w:hAnsi="Symbol" w:hint="default"/>
+        <w:sz w:val="20"/>
+      </w:rPr>
+    </w:lvl>
+    <w:lvl w:ilvl="1" w:tentative="1">
+      <w:start w:val="1"/>
+      <w:numFmt w:val="bullet"/>
+      <w:lvlText w:val="o"/>
+      <w:lvlJc w:val="left"/>
+      <w:pPr>
+        <w:tabs>
+          <w:tab w:val="num" w:pos="1440"/>
+        </w:tabs>
+        <w:ind w:left="1440" w:hanging="360"/>
+      </w:pPr>
+      <w:rPr>
+        <w:rFonts w:ascii="Courier New" w:hAnsi="Courier New" w:hint="default"/>
+        <w:sz w:val="20"/>
+      </w:rPr>
+    </w:lvl>
+    <w:lvl w:ilvl="2" w:tentative="1">
+      <w:start w:val="1"/>
+      <w:numFmt w:val="bullet"/>
+      <w:lvlText w:val=""/>
+      <w:lvlJc w:val="left"/>
+      <w:pPr>
+        <w:tabs>
+          <w:tab w:val="num" w:pos="2160"/>
+        </w:tabs>
+        <w:ind w:left="2160" w:hanging="360"/>
+      </w:pPr>
+      <w:rPr>
+        <w:rFonts w:ascii="Wingdings" w:hAnsi="Wingdings" w:hint="default"/>
+        <w:sz w:val="20"/>
+      </w:rPr>
+    </w:lvl>
+    <w:lvl w:ilvl="3" w:tentative="1">
+      <w:start w:val="1"/>
+      <w:numFmt w:val="bullet"/>
+      <w:lvlText w:val=""/>
+      <w:lvlJc w:val="left"/>
+      <w:pPr>
+        <w:tabs>
+          <w:tab w:val="num" w:pos="2880"/>
+        </w:tabs>
+        <w:ind w:left="2880" w:hanging="360"/>
+      </w:pPr>
+      <w:rPr>
+        <w:rFonts w:ascii="Wingdings" w:hAnsi="Wingdings" w:hint="default"/>
+        <w:sz w:val="20"/>
+      </w:rPr>
+    </w:lvl>
+    <w:lvl w:ilvl="4" w:tentative="1">
+      <w:start w:val="1"/>
+      <w:numFmt w:val="bullet"/>
+      <w:lvlText w:val=""/>
+      <w:lvlJc w:val="left"/>
+      <w:pPr>
+        <w:tabs>
+          <w:tab w:val="num" w:pos="3600"/>
+        </w:tabs>
+        <w:ind w:left="3600" w:hanging="360"/>
+      </w:pPr>
+      <w:rPr>
+        <w:rFonts w:ascii="Wingdings" w:hAnsi="Wingdings" w:hint="default"/>
+        <w:sz w:val="20"/>
+      </w:rPr>
+    </w:lvl>
+    <w:lvl w:ilvl="5" w:tentative="1">
+      <w:start w:val="1"/>
+      <w:numFmt w:val="bullet"/>
+      <w:lvlText w:val=""/>
+      <w:lvlJc w:val="left"/>
+      <w:pPr>
+        <w:tabs>
+          <w:tab w:val="num" w:pos="4320"/>
+        </w:tabs>
+        <w:ind w:left="4320" w:hanging="360"/>
+      </w:pPr>
+      <w:rPr>
+        <w:rFonts w:ascii="Wingdings" w:hAnsi="Wingdings" w:hint="default"/>
+        <w:sz w:val="20"/>
+      </w:rPr>
+    </w:lvl>
+    <w:lvl w:ilvl="6" w:tentative="1">
+      <w:start w:val="1"/>
+      <w:numFmt w:val="bullet"/>
+      <w:lvlText w:val=""/>
+      <w:lvlJc w:val="left"/>
+      <w:pPr>
+        <w:tabs>
+          <w:tab w:val="num" w:pos="5040"/>
+        </w:tabs>
+        <w:ind w:left="5040" w:hanging="360"/>
+      </w:pPr>
+      <w:rPr>
+        <w:rFonts w:ascii="Wingdings" w:hAnsi="Wingdings" w:hint="default"/>
+        <w:sz w:val="20"/>
+      </w:rPr>
+    </w:lvl>
+    <w:lvl w:ilvl="7" w:tentative="1">
+      <w:start w:val="1"/>
+      <w:numFmt w:val="bullet"/>
+      <w:lvlText w:val=""/>
+      <w:lvlJc w:val="left"/>
+      <w:pPr>
+        <w:tabs>
+          <w:tab w:val="num" w:pos="5760"/>
+        </w:tabs>
+        <w:ind w:left="5760" w:hanging="360"/>
+      </w:pPr>
+      <w:rPr>
+        <w:rFonts w:ascii="Wingdings" w:hAnsi="Wingdings" w:hint="default"/>
+        <w:sz w:val="20"/>
+      </w:rPr>
+    </w:lvl>
+    <w:lvl w:ilvl="8" w:tentative="1">
+      <w:start w:val="1"/>
+      <w:numFmt w:val="bullet"/>
+      <w:lvlText w:val=""/>
+      <w:lvlJc w:val="left"/>
+      <w:pPr>
+        <w:tabs>
+          <w:tab w:val="num" w:pos="6480"/>
+        </w:tabs>
+        <w:ind w:left="6480" w:hanging="360"/>
+      </w:pPr>
+      <w:rPr>
+        <w:rFonts w:ascii="Wingdings" w:hAnsi="Wingdings" w:hint="default"/>
+        <w:sz w:val="20"/>
+      </w:rPr>
+    </w:lvl>
+  </w:abstractNum>
+  <w:abstractNum w:abstractNumId="2" w15:restartNumberingAfterBreak="0">
+    <w:nsid w:val="2DA013A6"/>
+    <w:multiLevelType w:val="multilevel"/>
+    <w:tmpl w:val="F05238BA"/>
+    <w:lvl w:ilvl="0">
+      <w:start w:val="1"/>
+      <w:numFmt w:val="bullet"/>
+      <w:lvlText w:val=""/>
+      <w:lvlJc w:val="left"/>
+      <w:pPr>
+        <w:tabs>
+          <w:tab w:val="num" w:pos="720"/>
+        </w:tabs>
+        <w:ind w:left="720" w:hanging="360"/>
+      </w:pPr>
+      <w:rPr>
+        <w:rFonts w:ascii="Symbol" w:hAnsi="Symbol" w:hint="default"/>
+        <w:sz w:val="20"/>
+      </w:rPr>
+    </w:lvl>
+    <w:lvl w:ilvl="1" w:tentative="1">
+      <w:start w:val="1"/>
+      <w:numFmt w:val="bullet"/>
+      <w:lvlText w:val="o"/>
+      <w:lvlJc w:val="left"/>
+      <w:pPr>
+        <w:tabs>
+          <w:tab w:val="num" w:pos="1440"/>
+        </w:tabs>
+        <w:ind w:left="1440" w:hanging="360"/>
+      </w:pPr>
+      <w:rPr>
+        <w:rFonts w:ascii="Courier New" w:hAnsi="Courier New" w:hint="default"/>
+        <w:sz w:val="20"/>
+      </w:rPr>
+    </w:lvl>
+    <w:lvl w:ilvl="2" w:tentative="1">
+      <w:start w:val="1"/>
+      <w:numFmt w:val="bullet"/>
+      <w:lvlText w:val=""/>
+      <w:lvlJc w:val="left"/>
+      <w:pPr>
+        <w:tabs>
+          <w:tab w:val="num" w:pos="2160"/>
+        </w:tabs>
+        <w:ind w:left="2160" w:hanging="360"/>
+      </w:pPr>
+      <w:rPr>
+        <w:rFonts w:ascii="Wingdings" w:hAnsi="Wingdings" w:hint="default"/>
+        <w:sz w:val="20"/>
+      </w:rPr>
+    </w:lvl>
+    <w:lvl w:ilvl="3" w:tentative="1">
+      <w:start w:val="1"/>
+      <w:numFmt w:val="bullet"/>
+      <w:lvlText w:val=""/>
+      <w:lvlJc w:val="left"/>
+      <w:pPr>
+        <w:tabs>
+          <w:tab w:val="num" w:pos="2880"/>
+        </w:tabs>
+        <w:ind w:left="2880" w:hanging="360"/>
+      </w:pPr>
+      <w:rPr>
+        <w:rFonts w:ascii="Wingdings" w:hAnsi="Wingdings" w:hint="default"/>
+        <w:sz w:val="20"/>
+      </w:rPr>
+    </w:lvl>
+    <w:lvl w:ilvl="4" w:tentative="1">
+      <w:start w:val="1"/>
+      <w:numFmt w:val="bullet"/>
+      <w:lvlText w:val=""/>
+      <w:lvlJc w:val="left"/>
+      <w:pPr>
+        <w:tabs>
+          <w:tab w:val="num" w:pos="3600"/>
+        </w:tabs>
+        <w:ind w:left="3600" w:hanging="360"/>
+      </w:pPr>
+      <w:rPr>
+        <w:rFonts w:ascii="Wingdings" w:hAnsi="Wingdings" w:hint="default"/>
+        <w:sz w:val="20"/>
+      </w:rPr>
+    </w:lvl>
+    <w:lvl w:ilvl="5" w:tentative="1">
+      <w:start w:val="1"/>
+      <w:numFmt w:val="bullet"/>
+      <w:lvlText w:val=""/>
+      <w:lvlJc w:val="left"/>
+      <w:pPr>
+        <w:tabs>
+          <w:tab w:val="num" w:pos="4320"/>
+        </w:tabs>
+        <w:ind w:left="4320" w:hanging="360"/>
+      </w:pPr>
+      <w:rPr>
+        <w:rFonts w:ascii="Wingdings" w:hAnsi="Wingdings" w:hint="default"/>
+        <w:sz w:val="20"/>
+      </w:rPr>
+    </w:lvl>
+    <w:lvl w:ilvl="6" w:tentative="1">
+      <w:start w:val="1"/>
+      <w:numFmt w:val="bullet"/>
+      <w:lvlText w:val=""/>
+      <w:lvlJc w:val="left"/>
+      <w:pPr>
+        <w:tabs>
+          <w:tab w:val="num" w:pos="5040"/>
+        </w:tabs>
+        <w:ind w:left="5040" w:hanging="360"/>
+      </w:pPr>
+      <w:rPr>
+        <w:rFonts w:ascii="Wingdings" w:hAnsi="Wingdings" w:hint="default"/>
+        <w:sz w:val="20"/>
+      </w:rPr>
+    </w:lvl>
+    <w:lvl w:ilvl="7" w:tentative="1">
+      <w:start w:val="1"/>
+      <w:numFmt w:val="bullet"/>
+      <w:lvlText w:val=""/>
+      <w:lvlJc w:val="left"/>
+      <w:pPr>
+        <w:tabs>
+          <w:tab w:val="num" w:pos="5760"/>
+        </w:tabs>
+        <w:ind w:left="5760" w:hanging="360"/>
+      </w:pPr>
+      <w:rPr>
+        <w:rFonts w:ascii="Wingdings" w:hAnsi="Wingdings" w:hint="default"/>
+        <w:sz w:val="20"/>
+      </w:rPr>
+    </w:lvl>
+    <w:lvl w:ilvl="8" w:tentative="1">
+      <w:start w:val="1"/>
+      <w:numFmt w:val="bullet"/>
+      <w:lvlText w:val=""/>
+      <w:lvlJc w:val="left"/>
+      <w:pPr>
+        <w:tabs>
+          <w:tab w:val="num" w:pos="6480"/>
+        </w:tabs>
+        <w:ind w:left="6480" w:hanging="360"/>
+      </w:pPr>
+      <w:rPr>
+        <w:rFonts w:ascii="Wingdings" w:hAnsi="Wingdings" w:hint="default"/>
+        <w:sz w:val="20"/>
+      </w:rPr>
+    </w:lvl>
+  </w:abstractNum>
+  <w:abstractNum w:abstractNumId="3" w15:restartNumberingAfterBreak="0">
+    <w:nsid w:val="2ECD32E4"/>
+    <w:multiLevelType w:val="multilevel"/>
+    <w:tmpl w:val="10A4D120"/>
+    <w:lvl w:ilvl="0">
+      <w:start w:val="1"/>
+      <w:numFmt w:val="bullet"/>
+      <w:lvlText w:val=""/>
+      <w:lvlJc w:val="left"/>
+      <w:pPr>
+        <w:tabs>
+          <w:tab w:val="num" w:pos="720"/>
+        </w:tabs>
+        <w:ind w:left="720" w:hanging="360"/>
+      </w:pPr>
+      <w:rPr>
+        <w:rFonts w:ascii="Symbol" w:hAnsi="Symbol" w:hint="default"/>
+        <w:sz w:val="20"/>
+      </w:rPr>
+    </w:lvl>
+    <w:lvl w:ilvl="1" w:tentative="1">
+      <w:start w:val="1"/>
+      <w:numFmt w:val="bullet"/>
+      <w:lvlText w:val="o"/>
+      <w:lvlJc w:val="left"/>
+      <w:pPr>
+        <w:tabs>
+          <w:tab w:val="num" w:pos="1440"/>
+        </w:tabs>
+        <w:ind w:left="1440" w:hanging="360"/>
+      </w:pPr>
+      <w:rPr>
+        <w:rFonts w:ascii="Courier New" w:hAnsi="Courier New" w:hint="default"/>
+        <w:sz w:val="20"/>
+      </w:rPr>
+    </w:lvl>
+    <w:lvl w:ilvl="2" w:tentative="1">
+      <w:start w:val="1"/>
+      <w:numFmt w:val="bullet"/>
+      <w:lvlText w:val=""/>
+      <w:lvlJc w:val="left"/>
+      <w:pPr>
+        <w:tabs>
+          <w:tab w:val="num" w:pos="2160"/>
+        </w:tabs>
+        <w:ind w:left="2160" w:hanging="360"/>
+      </w:pPr>
+      <w:rPr>
+        <w:rFonts w:ascii="Wingdings" w:hAnsi="Wingdings" w:hint="default"/>
+        <w:sz w:val="20"/>
+      </w:rPr>
+    </w:lvl>
+    <w:lvl w:ilvl="3" w:tentative="1">
+      <w:start w:val="1"/>
+      <w:numFmt w:val="bullet"/>
+      <w:lvlText w:val=""/>
+      <w:lvlJc w:val="left"/>
+      <w:pPr>
+        <w:tabs>
+          <w:tab w:val="num" w:pos="2880"/>
+        </w:tabs>
+        <w:ind w:left="2880" w:hanging="360"/>
+      </w:pPr>
+      <w:rPr>
+        <w:rFonts w:ascii="Wingdings" w:hAnsi="Wingdings" w:hint="default"/>
+        <w:sz w:val="20"/>
+      </w:rPr>
+    </w:lvl>
+    <w:lvl w:ilvl="4" w:tentative="1">
+      <w:start w:val="1"/>
+      <w:numFmt w:val="bullet"/>
+      <w:lvlText w:val=""/>
+      <w:lvlJc w:val="left"/>
+      <w:pPr>
+        <w:tabs>
+          <w:tab w:val="num" w:pos="3600"/>
+        </w:tabs>
+        <w:ind w:left="3600" w:hanging="360"/>
+      </w:pPr>
+      <w:rPr>
+        <w:rFonts w:ascii="Wingdings" w:hAnsi="Wingdings" w:hint="default"/>
+        <w:sz w:val="20"/>
+      </w:rPr>
+    </w:lvl>
+    <w:lvl w:ilvl="5" w:tentative="1">
+      <w:start w:val="1"/>
+      <w:numFmt w:val="bullet"/>
+      <w:lvlText w:val=""/>
+      <w:lvlJc w:val="left"/>
+      <w:pPr>
+        <w:tabs>
+          <w:tab w:val="num" w:pos="4320"/>
+        </w:tabs>
+        <w:ind w:left="4320" w:hanging="360"/>
+      </w:pPr>
+      <w:rPr>
+        <w:rFonts w:ascii="Wingdings" w:hAnsi="Wingdings" w:hint="default"/>
+        <w:sz w:val="20"/>
+      </w:rPr>
+    </w:lvl>
+    <w:lvl w:ilvl="6" w:tentative="1">
+      <w:start w:val="1"/>
+      <w:numFmt w:val="bullet"/>
+      <w:lvlText w:val=""/>
+      <w:lvlJc w:val="left"/>
+      <w:pPr>
+        <w:tabs>
+          <w:tab w:val="num" w:pos="5040"/>
+        </w:tabs>
+        <w:ind w:left="5040" w:hanging="360"/>
+      </w:pPr>
+      <w:rPr>
+        <w:rFonts w:ascii="Wingdings" w:hAnsi="Wingdings" w:hint="default"/>
+        <w:sz w:val="20"/>
+      </w:rPr>
+    </w:lvl>
+    <w:lvl w:ilvl="7" w:tentative="1">
+      <w:start w:val="1"/>
+      <w:numFmt w:val="bullet"/>
+      <w:lvlText w:val=""/>
+      <w:lvlJc w:val="left"/>
+      <w:pPr>
+        <w:tabs>
+          <w:tab w:val="num" w:pos="5760"/>
+        </w:tabs>
+        <w:ind w:left="5760" w:hanging="360"/>
+      </w:pPr>
+      <w:rPr>
+        <w:rFonts w:ascii="Wingdings" w:hAnsi="Wingdings" w:hint="default"/>
+        <w:sz w:val="20"/>
+      </w:rPr>
+    </w:lvl>
+    <w:lvl w:ilvl="8" w:tentative="1">
+      <w:start w:val="1"/>
+      <w:numFmt w:val="bullet"/>
+      <w:lvlText w:val=""/>
+      <w:lvlJc w:val="left"/>
+      <w:pPr>
+        <w:tabs>
+          <w:tab w:val="num" w:pos="6480"/>
+        </w:tabs>
+        <w:ind w:left="6480" w:hanging="360"/>
+      </w:pPr>
+      <w:rPr>
+        <w:rFonts w:ascii="Wingdings" w:hAnsi="Wingdings" w:hint="default"/>
+        <w:sz w:val="20"/>
+      </w:rPr>
+    </w:lvl>
+  </w:abstractNum>
+  <w:abstractNum w:abstractNumId="4" w15:restartNumberingAfterBreak="0">
+    <w:nsid w:val="55810EFE"/>
+    <w:multiLevelType w:val="multilevel"/>
+    <w:tmpl w:val="A9385D9E"/>
+    <w:lvl w:ilvl="0">
+      <w:start w:val="1"/>
+      <w:numFmt w:val="bullet"/>
+      <w:lvlText w:val=""/>
+      <w:lvlJc w:val="left"/>
+      <w:pPr>
+        <w:tabs>
+          <w:tab w:val="num" w:pos="720"/>
+        </w:tabs>
+        <w:ind w:left="720" w:hanging="360"/>
+      </w:pPr>
+      <w:rPr>
+        <w:rFonts w:ascii="Symbol" w:hAnsi="Symbol" w:hint="default"/>
+        <w:sz w:val="20"/>
+      </w:rPr>
+    </w:lvl>
+    <w:lvl w:ilvl="1" w:tentative="1">
+      <w:start w:val="1"/>
+      <w:numFmt w:val="bullet"/>
+      <w:lvlText w:val="o"/>
+      <w:lvlJc w:val="left"/>
+      <w:pPr>
+        <w:tabs>
+          <w:tab w:val="num" w:pos="1440"/>
+        </w:tabs>
+        <w:ind w:left="1440" w:hanging="360"/>
+      </w:pPr>
+      <w:rPr>
+        <w:rFonts w:ascii="Courier New" w:hAnsi="Courier New" w:hint="default"/>
+        <w:sz w:val="20"/>
+      </w:rPr>
+    </w:lvl>
+    <w:lvl w:ilvl="2" w:tentative="1">
+      <w:start w:val="1"/>
+      <w:numFmt w:val="bullet"/>
+      <w:lvlText w:val=""/>
+      <w:lvlJc w:val="left"/>
+      <w:pPr>
+        <w:tabs>
+          <w:tab w:val="num" w:pos="2160"/>
+        </w:tabs>
+        <w:ind w:left="2160" w:hanging="360"/>
+      </w:pPr>
+      <w:rPr>
+        <w:rFonts w:ascii="Wingdings" w:hAnsi="Wingdings" w:hint="default"/>
+        <w:sz w:val="20"/>
+      </w:rPr>
+    </w:lvl>
+    <w:lvl w:ilvl="3" w:tentative="1">
+      <w:start w:val="1"/>
+      <w:numFmt w:val="bullet"/>
+      <w:lvlText w:val=""/>
+      <w:lvlJc w:val="left"/>
+      <w:pPr>
+        <w:tabs>
+          <w:tab w:val="num" w:pos="2880"/>
+        </w:tabs>
+        <w:ind w:left="2880" w:hanging="360"/>
+      </w:pPr>
+      <w:rPr>
+        <w:rFonts w:ascii="Wingdings" w:hAnsi="Wingdings" w:hint="default"/>
+        <w:sz w:val="20"/>
+      </w:rPr>
+    </w:lvl>
+    <w:lvl w:ilvl="4" w:tentative="1">
+      <w:start w:val="1"/>
+      <w:numFmt w:val="bullet"/>
+      <w:lvlText w:val=""/>
+      <w:lvlJc w:val="left"/>
+      <w:pPr>
+        <w:tabs>
+          <w:tab w:val="num" w:pos="3600"/>
+        </w:tabs>
+        <w:ind w:left="3600" w:hanging="360"/>
+      </w:pPr>
+      <w:rPr>
+        <w:rFonts w:ascii="Wingdings" w:hAnsi="Wingdings" w:hint="default"/>
+        <w:sz w:val="20"/>
+      </w:rPr>
+    </w:lvl>
+    <w:lvl w:ilvl="5" w:tentative="1">
+      <w:start w:val="1"/>
+      <w:numFmt w:val="bullet"/>
+      <w:lvlText w:val=""/>
+      <w:lvlJc w:val="left"/>
+      <w:pPr>
+        <w:tabs>
+          <w:tab w:val="num" w:pos="4320"/>
+        </w:tabs>
+        <w:ind w:left="4320" w:hanging="360"/>
+      </w:pPr>
+      <w:rPr>
+        <w:rFonts w:ascii="Wingdings" w:hAnsi="Wingdings" w:hint="default"/>
+        <w:sz w:val="20"/>
+      </w:rPr>
+    </w:lvl>
+    <w:lvl w:ilvl="6" w:tentative="1">
+      <w:start w:val="1"/>
+      <w:numFmt w:val="bullet"/>
+      <w:lvlText w:val=""/>
+      <w:lvlJc w:val="left"/>
+      <w:pPr>
+        <w:tabs>
+          <w:tab w:val="num" w:pos="5040"/>
+        </w:tabs>
+        <w:ind w:left="5040" w:hanging="360"/>
+      </w:pPr>
+      <w:rPr>
+        <w:rFonts w:ascii="Wingdings" w:hAnsi="Wingdings" w:hint="default"/>
+        <w:sz w:val="20"/>
+      </w:rPr>
+    </w:lvl>
+    <w:lvl w:ilvl="7" w:tentative="1">
+      <w:start w:val="1"/>
+      <w:numFmt w:val="bullet"/>
+      <w:lvlText w:val=""/>
+      <w:lvlJc w:val="left"/>
+      <w:pPr>
+        <w:tabs>
+          <w:tab w:val="num" w:pos="5760"/>
+        </w:tabs>
+        <w:ind w:left="5760" w:hanging="360"/>
+      </w:pPr>
+      <w:rPr>
+        <w:rFonts w:ascii="Wingdings" w:hAnsi="Wingdings" w:hint="default"/>
+        <w:sz w:val="20"/>
+      </w:rPr>
+    </w:lvl>
+    <w:lvl w:ilvl="8" w:tentative="1">
+      <w:start w:val="1"/>
+      <w:numFmt w:val="bullet"/>
+      <w:lvlText w:val=""/>
+      <w:lvlJc w:val="left"/>
+      <w:pPr>
+        <w:tabs>
+          <w:tab w:val="num" w:pos="6480"/>
+        </w:tabs>
+        <w:ind w:left="6480" w:hanging="360"/>
+      </w:pPr>
+      <w:rPr>
+        <w:rFonts w:ascii="Wingdings" w:hAnsi="Wingdings" w:hint="default"/>
+        <w:sz w:val="20"/>
+      </w:rPr>
+    </w:lvl>
+  </w:abstractNum>
+  <w:abstractNum w:abstractNumId="5" w15:restartNumberingAfterBreak="0">
+    <w:nsid w:val="795173D8"/>
+    <w:multiLevelType w:val="multilevel"/>
+    <w:tmpl w:val="CB122416"/>
+    <w:lvl w:ilvl="0">
+      <w:start w:val="1"/>
+      <w:numFmt w:val="bullet"/>
+      <w:lvlText w:val=""/>
+      <w:lvlJc w:val="left"/>
+      <w:pPr>
+        <w:tabs>
+          <w:tab w:val="num" w:pos="720"/>
+        </w:tabs>
+        <w:ind w:left="720" w:hanging="360"/>
+      </w:pPr>
+      <w:rPr>
+        <w:rFonts w:ascii="Symbol" w:hAnsi="Symbol" w:hint="default"/>
+        <w:sz w:val="20"/>
+      </w:rPr>
+    </w:lvl>
+    <w:lvl w:ilvl="1" w:tentative="1">
+      <w:start w:val="1"/>
+      <w:numFmt w:val="bullet"/>
+      <w:lvlText w:val="o"/>
+      <w:lvlJc w:val="left"/>
+      <w:pPr>
+        <w:tabs>
+          <w:tab w:val="num" w:pos="1440"/>
+        </w:tabs>
+        <w:ind w:left="1440" w:hanging="360"/>
+      </w:pPr>
+      <w:rPr>
+        <w:rFonts w:ascii="Courier New" w:hAnsi="Courier New" w:hint="default"/>
+        <w:sz w:val="20"/>
+      </w:rPr>
+    </w:lvl>
+    <w:lvl w:ilvl="2" w:tentative="1">
+      <w:start w:val="1"/>
+      <w:numFmt w:val="bullet"/>
+      <w:lvlText w:val=""/>
+      <w:lvlJc w:val="left"/>
+      <w:pPr>
+        <w:tabs>
+          <w:tab w:val="num" w:pos="2160"/>
+        </w:tabs>
+        <w:ind w:left="2160" w:hanging="360"/>
+      </w:pPr>
+      <w:rPr>
+        <w:rFonts w:ascii="Wingdings" w:hAnsi="Wingdings" w:hint="default"/>
+        <w:sz w:val="20"/>
+      </w:rPr>
+    </w:lvl>
+    <w:lvl w:ilvl="3" w:tentative="1">
+      <w:start w:val="1"/>
+      <w:numFmt w:val="bullet"/>
+      <w:lvlText w:val=""/>
+      <w:lvlJc w:val="left"/>
+      <w:pPr>
+        <w:tabs>
+          <w:tab w:val="num" w:pos="2880"/>
+        </w:tabs>
+        <w:ind w:left="2880" w:hanging="360"/>
+      </w:pPr>
+      <w:rPr>
+        <w:rFonts w:ascii="Wingdings" w:hAnsi="Wingdings" w:hint="default"/>
+        <w:sz w:val="20"/>
+      </w:rPr>
+    </w:lvl>
+    <w:lvl w:ilvl="4" w:tentative="1">
+      <w:start w:val="1"/>
+      <w:numFmt w:val="bullet"/>
+      <w:lvlText w:val=""/>
+      <w:lvlJc w:val="left"/>
+      <w:pPr>
+        <w:tabs>
+          <w:tab w:val="num" w:pos="3600"/>
+        </w:tabs>
+        <w:ind w:left="3600" w:hanging="360"/>
+      </w:pPr>
+      <w:rPr>
+        <w:rFonts w:ascii="Wingdings" w:hAnsi="Wingdings" w:hint="default"/>
+        <w:sz w:val="20"/>
+      </w:rPr>
+    </w:lvl>
+    <w:lvl w:ilvl="5" w:tentative="1">
+      <w:start w:val="1"/>
+      <w:numFmt w:val="bullet"/>
+      <w:lvlText w:val=""/>
+      <w:lvlJc w:val="left"/>
+      <w:pPr>
+        <w:tabs>
+          <w:tab w:val="num" w:pos="4320"/>
+        </w:tabs>
+        <w:ind w:left="4320" w:hanging="360"/>
+      </w:pPr>
+      <w:rPr>
+        <w:rFonts w:ascii="Wingdings" w:hAnsi="Wingdings" w:hint="default"/>
+        <w:sz w:val="20"/>
+      </w:rPr>
+    </w:lvl>
+    <w:lvl w:ilvl="6" w:tentative="1">
+      <w:start w:val="1"/>
+      <w:numFmt w:val="bullet"/>
+      <w:lvlText w:val=""/>
+      <w:lvlJc w:val="left"/>
+      <w:pPr>
+        <w:tabs>
+          <w:tab w:val="num" w:pos="5040"/>
+        </w:tabs>
+        <w:ind w:left="5040" w:hanging="360"/>
+      </w:pPr>
+      <w:rPr>
+        <w:rFonts w:ascii="Wingdings" w:hAnsi="Wingdings" w:hint="default"/>
+        <w:sz w:val="20"/>
+      </w:rPr>
+    </w:lvl>
+    <w:lvl w:ilvl="7" w:tentative="1">
+      <w:start w:val="1"/>
+      <w:numFmt w:val="bullet"/>
+      <w:lvlText w:val=""/>
+      <w:lvlJc w:val="left"/>
+      <w:pPr>
+        <w:tabs>
+          <w:tab w:val="num" w:pos="5760"/>
+        </w:tabs>
+        <w:ind w:left="5760" w:hanging="360"/>
+      </w:pPr>
+      <w:rPr>
+        <w:rFonts w:ascii="Wingdings" w:hAnsi="Wingdings" w:hint="default"/>
+        <w:sz w:val="20"/>
+      </w:rPr>
+    </w:lvl>
+    <w:lvl w:ilvl="8" w:tentative="1">
+      <w:start w:val="1"/>
+      <w:numFmt w:val="bullet"/>
+      <w:lvlText w:val=""/>
+      <w:lvlJc w:val="left"/>
+      <w:pPr>
+        <w:tabs>
+          <w:tab w:val="num" w:pos="6480"/>
+        </w:tabs>
+        <w:ind w:left="6480" w:hanging="360"/>
+      </w:pPr>
+      <w:rPr>
+        <w:rFonts w:ascii="Wingdings" w:hAnsi="Wingdings" w:hint="default"/>
+        <w:sz w:val="20"/>
+      </w:rPr>
+    </w:lvl>
+  </w:abstractNum>
+  <w:num w:numId="1" w16cid:durableId="1421172446">
+    <w:abstractNumId w:val="2"/>
+  </w:num>
+  <w:num w:numId="2" w16cid:durableId="700202066">
+    <w:abstractNumId w:val="1"/>
+  </w:num>
+  <w:num w:numId="3" w16cid:durableId="2013606891">
+    <w:abstractNumId w:val="4"/>
+  </w:num>
+  <w:num w:numId="4" w16cid:durableId="1762330611">
+    <w:abstractNumId w:val="5"/>
+  </w:num>
+  <w:num w:numId="5" w16cid:durableId="458649116">
+    <w:abstractNumId w:val="3"/>
+  </w:num>
+  <w:num w:numId="6" w16cid:durableId="1734427746">
+    <w:abstractNumId w:val="0"/>
+  </w:num>
+</w:numbering>
 </file>
 
 <file path=word/styles.xml><?xml version="1.0" encoding="utf-8"?>
@@ -1531,7 +3583,6 @@
   <w:style w:type="character" w:default="1" w:styleId="a0">
     <w:name w:val="Default Paragraph Font"/>
     <w:uiPriority w:val="1"/>
-    <w:semiHidden/>
     <w:unhideWhenUsed/>
   </w:style>
   <w:style w:type="table" w:default="1" w:styleId="a1">

</xml_diff>